<commit_message>
Ajustes Gravao de partes e Dashboards
</commit_message>
<xml_diff>
--- a/documentosCriados/S140-Janeiro.docx
+++ b/documentosCriados/S140-Janeiro.docx
@@ -142,7 +142,6 @@
         <w:tab/>
         <w:tab/>
         <w:tab/>
-        <w:tab/>
       </w:r>
       <w:r>
         <w:rPr>
@@ -169,7 +168,7 @@
           <w:szCs w:val="20"/>
           <w:lang w:val="pt-PT"/>
         </w:rPr>
-        <w:t>Maurício Cardozo</w:t>
+        <w:t>Mauricio Cardozo</w:t>
       </w:r>
     </w:p>
     <w:p>
@@ -317,8 +316,8 @@
         <w:tblLook w:firstRow="1" w:noVBand="1" w:lastRow="0" w:firstColumn="1" w:lastColumn="0" w:noHBand="0" w:val="04a0"/>
       </w:tblPr>
       <w:tblGrid>
-        <w:gridCol w:w="5147"/>
-        <w:gridCol w:w="2581"/>
+        <w:gridCol w:w="5148"/>
+        <w:gridCol w:w="2580"/>
         <w:gridCol w:w="2522"/>
       </w:tblGrid>
       <w:tr>
@@ -327,7 +326,7 @@
         </w:trPr>
         <w:tc>
           <w:tcPr>
-            <w:tcW w:w="5147" w:type="dxa"/>
+            <w:tcW w:w="5148" w:type="dxa"/>
             <w:tcBorders>
               <w:top w:val="nil"/>
               <w:left w:val="nil"/>
@@ -367,7 +366,7 @@
         </w:tc>
         <w:tc>
           <w:tcPr>
-            <w:tcW w:w="2581" w:type="dxa"/>
+            <w:tcW w:w="2580" w:type="dxa"/>
             <w:tcBorders>
               <w:top w:val="nil"/>
               <w:left w:val="nil"/>
@@ -500,17 +499,19 @@
         <w:tab/>
         <w:tab/>
         <w:t xml:space="preserve">  </w:t>
-      </w:r>
-      <w:r>
-        <w:rPr>
-          <w:rFonts w:eastAsia="Calibri" w:cs="Calibri" w:cstheme="minorHAnsi"/>
-          <w:b/>
-          <w:i/>
-          <w:sz w:val="20"/>
-          <w:szCs w:val="20"/>
-          <w:lang w:val="pt-PT"/>
-        </w:rPr>
-        <w:t>Alexandre Souza</w:t>
+        <w:tab/>
+        <w:t xml:space="preserve"> </w:t>
+      </w:r>
+      <w:r>
+        <w:rPr>
+          <w:rFonts w:eastAsia="Calibri" w:cs="Calibri" w:cstheme="minorHAnsi"/>
+          <w:b/>
+          <w:i/>
+          <w:sz w:val="20"/>
+          <w:szCs w:val="20"/>
+          <w:lang w:val="pt-PT"/>
+        </w:rPr>
+        <w:t xml:space="preserve"> Alexandre Souza</w:t>
       </w:r>
     </w:p>
     <w:p>
@@ -955,7 +956,7 @@
           <w:szCs w:val="22"/>
           <w:lang w:val="pt-BR" w:eastAsia="en-US" w:bidi="ar-SA"/>
         </w:rPr>
-        <w:t>Iniciando conversas</w:t>
+        <w:t>4. Iniciando conversas</w:t>
       </w:r>
       <w:r>
         <w:rPr>
@@ -972,7 +973,6 @@
           <w:szCs w:val="20"/>
         </w:rPr>
         <w:tab/>
-        <w:t xml:space="preserve"> </w:t>
       </w:r>
       <w:r>
         <w:rPr>
@@ -1002,9 +1002,7 @@
           <w:szCs w:val="20"/>
           <w:lang w:val="pt-PT"/>
         </w:rPr>
-        <w:t xml:space="preserve"> </w:t>
-        <w:tab/>
-        <w:t>Patrícia Carvalho  / Glaucia Gomes</w:t>
+        <w:t xml:space="preserve"> Patricia Carvalho   / Glaucia Gomes</w:t>
       </w:r>
     </w:p>
     <w:p>
@@ -1041,7 +1039,7 @@
           <w:sz w:val="20"/>
           <w:szCs w:val="20"/>
         </w:rPr>
-        <w:t>5.</w:t>
+        <w:t xml:space="preserve">5. </w:t>
       </w:r>
       <w:r>
         <w:rPr>
@@ -1054,7 +1052,7 @@
           <w:szCs w:val="22"/>
           <w:lang w:val="pt-BR" w:eastAsia="en-US" w:bidi="ar-SA"/>
         </w:rPr>
-        <w:t xml:space="preserve"> Cultivando o interesse</w:t>
+        <w:t>5. Cultivando o interesse</w:t>
       </w:r>
       <w:r>
         <w:rPr>
@@ -1070,6 +1068,7 @@
           <w:sz w:val="20"/>
           <w:szCs w:val="20"/>
         </w:rPr>
+        <w:tab/>
         <w:t xml:space="preserve"> </w:t>
       </w:r>
       <w:r>
@@ -1091,6 +1090,7 @@
         <w:tab/>
         <w:tab/>
         <w:tab/>
+        <w:t xml:space="preserve"> </w:t>
       </w:r>
       <w:r>
         <w:rPr>
@@ -1138,7 +1138,7 @@
           <w:sz w:val="20"/>
           <w:szCs w:val="20"/>
         </w:rPr>
-        <w:t>6.</w:t>
+        <w:t xml:space="preserve">6. </w:t>
       </w:r>
       <w:r>
         <w:rPr>
@@ -1151,7 +1151,7 @@
           <w:szCs w:val="22"/>
           <w:lang w:val="pt-BR" w:eastAsia="en-US" w:bidi="ar-SA"/>
         </w:rPr>
-        <w:t xml:space="preserve"> Discurso</w:t>
+        <w:t>6. Discurso</w:t>
       </w:r>
       <w:r>
         <w:rPr>
@@ -1170,7 +1170,6 @@
           <w:szCs w:val="20"/>
         </w:rPr>
         <w:tab/>
-        <w:tab/>
         <w:t xml:space="preserve"> </w:t>
       </w:r>
       <w:r>
@@ -1192,7 +1191,6 @@
         <w:tab/>
         <w:tab/>
         <w:tab/>
-        <w:tab/>
       </w:r>
       <w:r>
         <w:rPr>
@@ -1204,6 +1202,128 @@
           <w:lang w:val="pt-PT"/>
         </w:rPr>
         <w:t xml:space="preserve"> Wanderson Souza</w:t>
+      </w:r>
+    </w:p>
+    <w:p>
+      <w:pPr>
+        <w:pStyle w:val="Normal"/>
+        <w:spacing w:before="0" w:after="0"/>
+        <w:rPr>
+          <w:rFonts w:cs="Calibri" w:cstheme="minorHAnsi"/>
+          <w:sz w:val="20"/>
+          <w:szCs w:val="20"/>
+        </w:rPr>
+      </w:pPr>
+      <w:r>
+        <w:rPr>
+          <w:rFonts w:eastAsia="Calibri" w:cs="Calibri" w:cstheme="minorHAnsi"/>
+          <w:b/>
+          <w:color w:val="575A5D"/>
+          <w:sz w:val="20"/>
+          <w:szCs w:val="20"/>
+        </w:rPr>
+        <w:t>5:00</w:t>
+      </w:r>
+      <w:r>
+        <w:rPr>
+          <w:rFonts w:cs="Calibri" w:cstheme="minorHAnsi"/>
+          <w:sz w:val="20"/>
+          <w:szCs w:val="20"/>
+        </w:rPr>
+        <w:tab/>
+      </w:r>
+      <w:r>
+        <w:rPr>
+          <w:rFonts w:eastAsia="Calibri" w:cs="Calibri" w:cstheme="minorHAnsi"/>
+          <w:b/>
+          <w:color w:val="575A5D"/>
+          <w:kern w:val="0"/>
+          <w:sz w:val="20"/>
+          <w:szCs w:val="20"/>
+          <w:lang w:val="pt-BR" w:eastAsia="en-US" w:bidi="ar-SA"/>
+        </w:rPr>
+        <w:t>7.</w:t>
+      </w:r>
+      <w:r>
+        <w:rPr>
+          <w:rFonts w:eastAsia="Calibri" w:cs="Calibri" w:cstheme="minorHAnsi"/>
+          <w:b/>
+          <w:color w:val="575A5D"/>
+          <w:sz w:val="20"/>
+          <w:szCs w:val="20"/>
+        </w:rPr>
+        <w:t xml:space="preserve"> </w:t>
+      </w:r>
+      <w:r>
+        <w:rPr>
+          <w:rFonts w:eastAsia="Calibri" w:cs="Calibri" w:cstheme="minorHAnsi"/>
+          <w:b/>
+          <w:bCs/>
+          <w:color w:val="auto"/>
+          <w:kern w:val="0"/>
+          <w:sz w:val="22"/>
+          <w:szCs w:val="22"/>
+          <w:lang w:val="pt-BR" w:eastAsia="en-US" w:bidi="ar-SA"/>
+        </w:rPr>
+        <w:t>não possui</w:t>
+      </w:r>
+      <w:r>
+        <w:rPr>
+          <w:rFonts w:cs="Calibri" w:cstheme="minorHAnsi"/>
+          <w:b/>
+          <w:bCs/>
+          <w:sz w:val="22"/>
+          <w:szCs w:val="22"/>
+        </w:rPr>
+        <w:tab/>
+      </w:r>
+      <w:r>
+        <w:rPr>
+          <w:rFonts w:cs="Calibri" w:cstheme="minorHAnsi"/>
+          <w:sz w:val="20"/>
+          <w:szCs w:val="20"/>
+        </w:rPr>
+        <w:tab/>
+        <w:t xml:space="preserve"> </w:t>
+      </w:r>
+      <w:r>
+        <w:rPr>
+          <w:rFonts w:cs="Calibri" w:ascii="Calibri;serif" w:hAnsi="Calibri;serif" w:cstheme="minorHAnsi"/>
+          <w:b/>
+          <w:color w:val="575A5D"/>
+          <w:sz w:val="16"/>
+          <w:szCs w:val="16"/>
+        </w:rPr>
+        <w:t>Estudante/Ajudante:</w:t>
+      </w:r>
+      <w:r>
+        <w:rPr>
+          <w:rFonts w:cs="Calibri" w:cstheme="minorHAnsi"/>
+          <w:sz w:val="20"/>
+          <w:szCs w:val="20"/>
+        </w:rPr>
+        <w:tab/>
+        <w:tab/>
+        <w:tab/>
+      </w:r>
+      <w:r>
+        <w:rPr>
+          <w:rFonts w:eastAsia="Calibri" w:cs="Calibri" w:cstheme="minorHAnsi"/>
+          <w:b/>
+          <w:i/>
+          <w:sz w:val="20"/>
+          <w:szCs w:val="20"/>
+          <w:lang w:val="pt-PT"/>
+        </w:rPr>
+        <w:t>não possui</w:t>
+      </w:r>
+      <w:r>
+        <w:rPr>
+          <w:rFonts w:cs="Calibri" w:cstheme="minorHAnsi"/>
+          <w:sz w:val="20"/>
+          <w:szCs w:val="20"/>
+        </w:rPr>
+        <w:tab/>
       </w:r>
     </w:p>
     <w:tbl>
@@ -1381,10 +1501,8 @@
           <w:rFonts w:eastAsia="Calibri" w:cs="Calibri" w:cstheme="minorHAnsi"/>
           <w:b/>
           <w:color w:val="575A5D"/>
-          <w:sz w:val="20"/>
-          <w:szCs w:val="20"/>
-        </w:rPr>
-        <w:t>7.</w:t>
+        </w:rPr>
+        <w:t>•</w:t>
       </w:r>
       <w:r>
         <w:rPr>
@@ -1396,7 +1514,7 @@
           <w:szCs w:val="22"/>
           <w:lang w:val="af-ZA" w:bidi="ta-IN"/>
         </w:rPr>
-        <w:t xml:space="preserve"> ‘Lembre-se da Rocha de sua fortaleza’</w:t>
+        <w:t>7. ‘Lembre-se da Rocha de sua fortaleza’</w:t>
       </w:r>
       <w:r>
         <w:rPr>
@@ -1414,9 +1532,6 @@
         </w:rPr>
         <w:t xml:space="preserve"> </w:t>
         <w:tab/>
-        <w:tab/>
-        <w:tab/>
-        <w:tab/>
       </w:r>
       <w:r>
         <w:rPr>
@@ -1427,7 +1542,7 @@
           <w:szCs w:val="20"/>
           <w:lang w:val="pt-BR"/>
         </w:rPr>
-        <w:t>Moises Figueiró</w:t>
+        <w:t>Moises Figueiro</w:t>
       </w:r>
     </w:p>
     <w:p>
@@ -1461,10 +1576,8 @@
           <w:rFonts w:eastAsia="Calibri" w:cs="Calibri" w:cstheme="minorHAnsi"/>
           <w:b/>
           <w:color w:val="575A5D"/>
-          <w:sz w:val="20"/>
-          <w:szCs w:val="20"/>
-        </w:rPr>
-        <w:t>8.</w:t>
+        </w:rPr>
+        <w:t>•</w:t>
       </w:r>
       <w:r>
         <w:rPr>
@@ -1476,7 +1589,7 @@
           <w:szCs w:val="22"/>
           <w:lang w:val="af-ZA" w:bidi="ta-IN"/>
         </w:rPr>
-        <w:t xml:space="preserve"> Tire tempo todos os dias para aprender com os amigos de Jeová</w:t>
+        <w:t>8. Tire tempo todos os dias para aprender com os amigos de Jeová</w:t>
       </w:r>
       <w:r>
         <w:rPr>
@@ -1540,10 +1653,8 @@
           <w:rFonts w:eastAsia="Calibri" w:cs="Calibri" w:cstheme="minorHAnsi"/>
           <w:b/>
           <w:color w:val="575A5D"/>
-          <w:sz w:val="20"/>
-          <w:szCs w:val="20"/>
-        </w:rPr>
-        <w:t>9.</w:t>
+        </w:rPr>
+        <w:t>•</w:t>
       </w:r>
       <w:r>
         <w:rPr>
@@ -1555,7 +1666,7 @@
           <w:szCs w:val="22"/>
           <w:lang w:val="af-ZA" w:bidi="ta-IN"/>
         </w:rPr>
-        <w:t xml:space="preserve"> Estudo bíblico de congregação lfb história 50, introdução da seção 9 e história 51</w:t>
+        <w:t>9. Estudo bíblico de congregação lfb história 50, introdução da seção 9 e história 51</w:t>
       </w:r>
       <w:r>
         <w:rPr>
@@ -1572,6 +1683,7 @@
           <w:szCs w:val="20"/>
         </w:rPr>
         <w:t xml:space="preserve"> </w:t>
+        <w:tab/>
       </w:r>
       <w:r>
         <w:rPr>
@@ -1584,7 +1696,7 @@
           <w:szCs w:val="20"/>
           <w:lang w:val="pt-BR" w:eastAsia="en-US" w:bidi="ar-SA"/>
         </w:rPr>
-        <w:t xml:space="preserve">Luiz Czarnos  / Rodrigo </w:t>
+        <w:t>Luiz Czarnos  / Rodrigo Ng</w:t>
       </w:r>
     </w:p>
     <w:p>
@@ -1706,7 +1818,18 @@
           <w:szCs w:val="20"/>
           <w:lang w:val="pt-PT"/>
         </w:rPr>
-        <w:t>Maurício Cardozo</w:t>
+        <w:t>p3</w:t>
+      </w:r>
+      <w:r>
+        <w:rPr>
+          <w:rFonts w:eastAsia="Calibri" w:cs="Calibri" w:cstheme="minorHAnsi"/>
+          <w:b/>
+          <w:i/>
+          <w:sz w:val="20"/>
+          <w:szCs w:val="20"/>
+          <w:lang w:val="pt-PT"/>
+        </w:rPr>
+        <w:t>4</w:t>
       </w:r>
     </w:p>
     <w:p>
@@ -1913,6 +2036,7 @@
         <w:tab/>
         <w:tab/>
         <w:tab/>
+        <w:tab/>
       </w:r>
       <w:r>
         <w:rPr>
@@ -2001,8 +2125,8 @@
         <w:tblLook w:firstRow="1" w:noVBand="1" w:lastRow="0" w:firstColumn="1" w:lastColumn="0" w:noHBand="0" w:val="04a0"/>
       </w:tblPr>
       <w:tblGrid>
-        <w:gridCol w:w="5147"/>
-        <w:gridCol w:w="2581"/>
+        <w:gridCol w:w="5148"/>
+        <w:gridCol w:w="2580"/>
         <w:gridCol w:w="2522"/>
       </w:tblGrid>
       <w:tr>
@@ -2011,7 +2135,7 @@
         </w:trPr>
         <w:tc>
           <w:tcPr>
-            <w:tcW w:w="5147" w:type="dxa"/>
+            <w:tcW w:w="5148" w:type="dxa"/>
             <w:tcBorders>
               <w:top w:val="nil"/>
               <w:left w:val="nil"/>
@@ -2051,7 +2175,7 @@
         </w:tc>
         <w:tc>
           <w:tcPr>
-            <w:tcW w:w="2581" w:type="dxa"/>
+            <w:tcW w:w="2580" w:type="dxa"/>
             <w:tcBorders>
               <w:top w:val="nil"/>
               <w:left w:val="nil"/>
@@ -2181,6 +2305,7 @@
         <w:tab/>
         <w:tab/>
         <w:tab/>
+        <w:tab/>
       </w:r>
       <w:r>
         <w:rPr>
@@ -2288,7 +2413,7 @@
           <w:szCs w:val="20"/>
           <w:lang w:val="pt-PT"/>
         </w:rPr>
-        <w:t>António Tadeu</w:t>
+        <w:t>Antonio Tadeu</w:t>
       </w:r>
     </w:p>
     <w:p>
@@ -2432,17 +2557,19 @@
         </w:rPr>
         <w:tab/>
         <w:tab/>
-      </w:r>
-      <w:r>
-        <w:rPr>
-          <w:rFonts w:eastAsia="Calibri" w:cs="Calibri" w:cstheme="minorHAnsi"/>
-          <w:b/>
-          <w:i/>
-          <w:sz w:val="20"/>
-          <w:szCs w:val="20"/>
-          <w:lang w:val="pt-PT"/>
-        </w:rPr>
-        <w:t>João Batista</w:t>
+        <w:tab/>
+        <w:tab/>
+      </w:r>
+      <w:r>
+        <w:rPr>
+          <w:rFonts w:eastAsia="Calibri" w:cs="Calibri" w:cstheme="minorHAnsi"/>
+          <w:b/>
+          <w:i/>
+          <w:sz w:val="20"/>
+          <w:szCs w:val="20"/>
+          <w:lang w:val="pt-PT"/>
+        </w:rPr>
+        <w:t>Joao Batista</w:t>
       </w:r>
     </w:p>
     <w:tbl>
@@ -2593,15 +2720,7 @@
           <w:b/>
           <w:color w:val="575A5D"/>
         </w:rPr>
-        <w:t>1</w:t>
-      </w:r>
-      <w:r>
-        <w:rPr>
-          <w:rFonts w:eastAsia="Calibri" w:cs="Calibri" w:cstheme="minorHAnsi"/>
-          <w:b/>
-          <w:color w:val="575A5D"/>
-        </w:rPr>
-        <w:t>:00</w:t>
+        <w:t>3:00</w:t>
       </w:r>
       <w:r>
         <w:rPr>
@@ -2643,7 +2762,7 @@
           <w:szCs w:val="22"/>
           <w:lang w:val="pt-BR" w:eastAsia="en-US" w:bidi="ar-SA"/>
         </w:rPr>
-        <w:t>Iniciando conversas</w:t>
+        <w:t>4. Iniciando conversas</w:t>
       </w:r>
       <w:r>
         <w:rPr>
@@ -2660,7 +2779,6 @@
           <w:szCs w:val="20"/>
         </w:rPr>
         <w:tab/>
-        <w:tab/>
       </w:r>
       <w:r>
         <w:rPr>
@@ -2691,29 +2809,7 @@
           <w:szCs w:val="20"/>
           <w:lang w:val="pt-BR"/>
         </w:rPr>
-        <w:t xml:space="preserve">Dina </w:t>
-      </w:r>
-      <w:r>
-        <w:rPr>
-          <w:rFonts w:eastAsia="Calibri" w:cs="Calibri" w:cstheme="minorHAnsi"/>
-          <w:b/>
-          <w:i/>
-          <w:sz w:val="20"/>
-          <w:szCs w:val="20"/>
-          <w:lang w:val="pt-BR"/>
-        </w:rPr>
-        <w:t>Barros</w:t>
-      </w:r>
-      <w:r>
-        <w:rPr>
-          <w:rFonts w:eastAsia="Calibri" w:cs="Calibri" w:cstheme="minorHAnsi"/>
-          <w:b/>
-          <w:i/>
-          <w:sz w:val="20"/>
-          <w:szCs w:val="20"/>
-          <w:lang w:val="pt-BR"/>
-        </w:rPr>
-        <w:t xml:space="preserve">  / Fabrio Júlio</w:t>
+        <w:t>Dina  / Fabrio Julio</w:t>
       </w:r>
     </w:p>
     <w:p>
@@ -2732,33 +2828,25 @@
           <w:b/>
           <w:color w:val="575A5D"/>
         </w:rPr>
-        <w:t>3</w:t>
-      </w:r>
-      <w:r>
-        <w:rPr>
-          <w:rFonts w:eastAsia="Calibri" w:cs="Calibri" w:cstheme="minorHAnsi"/>
-          <w:b/>
-          <w:color w:val="575A5D"/>
-        </w:rPr>
-        <w:t>:00</w:t>
-      </w:r>
-      <w:r>
-        <w:rPr>
-          <w:rFonts w:cs="Calibri" w:cstheme="minorHAnsi"/>
-          <w:sz w:val="20"/>
-          <w:szCs w:val="20"/>
-        </w:rPr>
-        <w:tab/>
-      </w:r>
-      <w:r>
-        <w:rPr>
-          <w:rFonts w:eastAsia="Calibri" w:cs="Calibri" w:cstheme="minorHAnsi"/>
-          <w:b/>
-          <w:color w:val="575A5D"/>
-          <w:sz w:val="20"/>
-          <w:szCs w:val="20"/>
-        </w:rPr>
-        <w:t>5.</w:t>
+        <w:t>4:00</w:t>
+      </w:r>
+      <w:r>
+        <w:rPr>
+          <w:rFonts w:cs="Calibri" w:cstheme="minorHAnsi"/>
+          <w:sz w:val="20"/>
+          <w:szCs w:val="20"/>
+        </w:rPr>
+        <w:tab/>
+      </w:r>
+      <w:r>
+        <w:rPr>
+          <w:rFonts w:eastAsia="Calibri" w:cs="Calibri" w:cstheme="minorHAnsi"/>
+          <w:b/>
+          <w:color w:val="575A5D"/>
+          <w:sz w:val="20"/>
+          <w:szCs w:val="20"/>
+        </w:rPr>
+        <w:t xml:space="preserve">5. </w:t>
       </w:r>
       <w:r>
         <w:rPr>
@@ -2771,7 +2859,7 @@
           <w:szCs w:val="22"/>
           <w:lang w:val="pt-BR" w:eastAsia="en-US" w:bidi="ar-SA"/>
         </w:rPr>
-        <w:t xml:space="preserve"> Iniciando conversas</w:t>
+        <w:t>5. Iniciando conversas</w:t>
       </w:r>
       <w:r>
         <w:rPr>
@@ -2789,7 +2877,6 @@
         </w:rPr>
         <w:tab/>
         <w:t xml:space="preserve"> </w:t>
-        <w:tab/>
       </w:r>
       <w:r>
         <w:rPr>
@@ -2820,18 +2907,7 @@
           <w:szCs w:val="20"/>
           <w:lang w:val="pt-PT"/>
         </w:rPr>
-        <w:t xml:space="preserve">Sofia / Stefani </w:t>
-      </w:r>
-      <w:r>
-        <w:rPr>
-          <w:rFonts w:eastAsia="Calibri" w:cs="Calibri" w:cstheme="minorHAnsi"/>
-          <w:b/>
-          <w:i/>
-          <w:sz w:val="20"/>
-          <w:szCs w:val="20"/>
-          <w:lang w:val="pt-PT"/>
-        </w:rPr>
-        <w:t xml:space="preserve">Conceição </w:t>
+        <w:t>Sofia  / Stafane Conceicao</w:t>
       </w:r>
     </w:p>
     <w:p>
@@ -2850,15 +2926,7 @@
           <w:b/>
           <w:color w:val="575A5D"/>
         </w:rPr>
-        <w:t>2</w:t>
-      </w:r>
-      <w:r>
-        <w:rPr>
-          <w:rFonts w:eastAsia="Calibri" w:cs="Calibri" w:cstheme="minorHAnsi"/>
-          <w:b/>
-          <w:color w:val="575A5D"/>
-        </w:rPr>
-        <w:t>:00</w:t>
+        <w:t>5:00</w:t>
       </w:r>
       <w:r>
         <w:rPr>
@@ -2889,7 +2957,7 @@
           <w:szCs w:val="22"/>
           <w:lang w:val="pt-BR" w:eastAsia="en-US" w:bidi="ar-SA"/>
         </w:rPr>
-        <w:t>Cultivando o interesse</w:t>
+        <w:t>6. Cultivando o interesse</w:t>
       </w:r>
       <w:r>
         <w:rPr>
@@ -2928,6 +2996,7 @@
         </w:rPr>
         <w:tab/>
         <w:tab/>
+        <w:tab/>
       </w:r>
       <w:r>
         <w:rPr>
@@ -2938,7 +3007,7 @@
           <w:szCs w:val="20"/>
           <w:lang w:val="pt-BR"/>
         </w:rPr>
-        <w:t>Daura  / Sandra Silva</w:t>
+        <w:t>Daura Caetano  / Sandra Silva</w:t>
       </w:r>
     </w:p>
     <w:p>
@@ -3011,7 +3080,7 @@
           <w:szCs w:val="22"/>
           <w:lang w:val="pt-BR" w:eastAsia="en-US" w:bidi="ar-SA"/>
         </w:rPr>
-        <w:t>Discurso</w:t>
+        <w:t>7. Discurso</w:t>
       </w:r>
       <w:r>
         <w:rPr>
@@ -3034,8 +3103,6 @@
           <w:szCs w:val="20"/>
           <w:lang w:val="pt-PT"/>
         </w:rPr>
-        <w:tab/>
-        <w:tab/>
         <w:tab/>
       </w:r>
       <w:r>
@@ -3211,32 +3278,9 @@
           <w:b/>
           <w:color w:val="575A5D"/>
         </w:rPr>
-        <w:t>1</w:t>
-      </w:r>
-      <w:r>
-        <w:rPr>
-          <w:rFonts w:eastAsia="Calibri" w:cs="Calibri" w:cstheme="minorHAnsi"/>
-          <w:b/>
-          <w:color w:val="575A5D"/>
-        </w:rPr>
-        <w:t>5</w:t>
-      </w:r>
-      <w:r>
-        <w:rPr>
-          <w:rFonts w:eastAsia="Calibri" w:cs="Calibri" w:cstheme="minorHAnsi"/>
-          <w:b/>
-          <w:color w:val="575A5D"/>
-        </w:rPr>
-        <w:t>:00</w:t>
-        <w:tab/>
-      </w:r>
-      <w:r>
-        <w:rPr>
-          <w:rFonts w:eastAsia="Calibri" w:cs="Calibri" w:cstheme="minorHAnsi"/>
-          <w:b/>
-          <w:color w:val="575A5D"/>
-        </w:rPr>
-        <w:t>8.</w:t>
+        <w:t>10:00</w:t>
+        <w:tab/>
+        <w:t>•</w:t>
       </w:r>
       <w:r>
         <w:rPr>
@@ -3250,7 +3294,7 @@
           <w:szCs w:val="22"/>
           <w:lang w:val="pt-BR" w:eastAsia="en-US" w:bidi="ar-SA"/>
         </w:rPr>
-        <w:t xml:space="preserve"> Necessidades locais</w:t>
+        <w:t>8. Necessidades locais</w:t>
       </w:r>
       <w:r>
         <w:rPr>
@@ -3273,12 +3317,7 @@
         </w:rPr>
         <w:tab/>
         <w:tab/>
-        <w:tab/>
-        <w:tab/>
-        <w:tab/>
-        <w:tab/>
         <w:t xml:space="preserve"> </w:t>
-        <w:tab/>
       </w:r>
       <w:r>
         <w:rPr>
@@ -3308,62 +3347,47 @@
           <w:b/>
           <w:color w:val="575A5D"/>
         </w:rPr>
-        <w:t>30:00</w:t>
-        <w:tab/>
-      </w:r>
-      <w:r>
-        <w:rPr>
-          <w:rFonts w:eastAsia="Calibri" w:cs="Calibri" w:cstheme="minorHAnsi"/>
-          <w:b/>
-          <w:color w:val="575A5D"/>
-        </w:rPr>
-        <w:t>9.</w:t>
+        <w:t>5:00</w:t>
+        <w:tab/>
+        <w:t>•</w:t>
       </w:r>
       <w:r>
         <w:rPr>
           <w:rStyle w:val="Emphasis"/>
-          <w:rFonts w:eastAsia="Times New Roman"/>
+          <w:rFonts w:eastAsia="Calibri" w:cs="Calibri" w:cstheme="minorHAnsi"/>
           <w:b/>
           <w:bCs/>
-          <w:lang w:val="af-ZA" w:bidi="ta-IN"/>
-        </w:rPr>
-        <w:t xml:space="preserve"> Estudo bíblico de congregação lfb histórias 52-53</w:t>
-      </w:r>
-      <w:r>
-        <w:rPr>
-          <w:rFonts w:cs="Calibri" w:cstheme="minorHAnsi"/>
-          <w:sz w:val="20"/>
-          <w:szCs w:val="20"/>
-        </w:rPr>
-        <w:t xml:space="preserve"> </w:t>
-        <w:tab/>
-        <w:tab/>
-      </w:r>
-      <w:r>
-        <w:rPr>
-          <w:rFonts w:eastAsia="Calibri" w:cs="Calibri" w:cstheme="minorHAnsi"/>
-          <w:b/>
-          <w:i/>
-          <w:color w:val="575A5D"/>
-          <w:sz w:val="20"/>
-          <w:szCs w:val="20"/>
-          <w:lang w:val="pt-PT"/>
-        </w:rPr>
-        <w:t xml:space="preserve"> </w:t>
-        <w:tab/>
-      </w:r>
-      <w:r>
-        <w:rPr>
-          <w:rFonts w:eastAsia="Calibri" w:cs="Calibri" w:cstheme="minorHAnsi"/>
-          <w:b/>
-          <w:i/>
           <w:color w:val="auto"/>
           <w:kern w:val="0"/>
+          <w:sz w:val="22"/>
+          <w:szCs w:val="22"/>
+          <w:lang w:val="pt-BR" w:eastAsia="en-US" w:bidi="ar-SA"/>
+        </w:rPr>
+        <w:t>não possue esta Parte</w:t>
+      </w:r>
+      <w:r>
+        <w:rPr>
+          <w:rFonts w:eastAsia="Calibri" w:cs="Calibri" w:cstheme="minorHAnsi"/>
+          <w:b/>
+          <w:color w:val="575A5D"/>
+        </w:rPr>
+        <w:t xml:space="preserve"> </w:t>
+        <w:tab/>
+        <w:tab/>
+        <w:t xml:space="preserve"> </w:t>
+      </w:r>
+      <w:r>
+        <w:rPr>
+          <w:rFonts w:eastAsia="Calibri" w:cs="Calibri" w:cstheme="minorHAnsi"/>
+          <w:b/>
+          <w:i/>
+          <w:color w:val="auto"/>
+          <w:kern w:val="0"/>
           <w:sz w:val="20"/>
           <w:szCs w:val="20"/>
           <w:lang w:val="pt-PT" w:eastAsia="en-US" w:bidi="ar-SA"/>
         </w:rPr>
-        <w:t>Maurício Cardozo  / Isaque Lucas</w:t>
+        <w:t>não possui</w:t>
       </w:r>
     </w:p>
     <w:p>
@@ -3371,6 +3395,72 @@
         <w:pStyle w:val="Normal"/>
         <w:spacing w:before="0" w:after="0"/>
         <w:rPr>
+          <w:rFonts w:eastAsia="Calibri" w:cs="Calibri" w:cstheme="minorHAnsi"/>
+          <w:b/>
+          <w:color w:val="575A5D"/>
+        </w:rPr>
+      </w:pPr>
+      <w:r>
+        <w:rPr>
+          <w:rFonts w:eastAsia="Calibri" w:cs="Calibri" w:cstheme="minorHAnsi"/>
+          <w:b/>
+          <w:color w:val="575A5D"/>
+        </w:rPr>
+        <w:t>30:00</w:t>
+        <w:tab/>
+        <w:t>•</w:t>
+      </w:r>
+      <w:r>
+        <w:rPr>
+          <w:rStyle w:val="Emphasis"/>
+          <w:rFonts w:eastAsia="Times New Roman"/>
+          <w:b/>
+          <w:bCs/>
+          <w:lang w:val="af-ZA" w:bidi="ta-IN"/>
+        </w:rPr>
+        <w:t>9. Estudo bíblico de congregação lfb histórias 52-53</w:t>
+      </w:r>
+      <w:r>
+        <w:rPr>
+          <w:rFonts w:cs="Calibri" w:cstheme="minorHAnsi"/>
+          <w:sz w:val="20"/>
+          <w:szCs w:val="20"/>
+        </w:rPr>
+        <w:t xml:space="preserve"> </w:t>
+        <w:tab/>
+        <w:tab/>
+      </w:r>
+      <w:r>
+        <w:rPr>
+          <w:rFonts w:eastAsia="Calibri" w:cs="Calibri" w:cstheme="minorHAnsi"/>
+          <w:b/>
+          <w:i/>
+          <w:color w:val="575A5D"/>
+          <w:sz w:val="20"/>
+          <w:szCs w:val="20"/>
+          <w:lang w:val="pt-PT"/>
+        </w:rPr>
+        <w:t xml:space="preserve"> </w:t>
+      </w:r>
+      <w:r>
+        <w:rPr>
+          <w:rFonts w:eastAsia="Calibri" w:cs="Calibri" w:cstheme="minorHAnsi"/>
+          <w:b/>
+          <w:i/>
+          <w:color w:val="auto"/>
+          <w:kern w:val="0"/>
+          <w:sz w:val="20"/>
+          <w:szCs w:val="20"/>
+          <w:lang w:val="pt-PT" w:eastAsia="en-US" w:bidi="ar-SA"/>
+        </w:rPr>
+        <w:t>Mauricio Cardozo  / Isaque Lucas</w:t>
+      </w:r>
+    </w:p>
+    <w:p>
+      <w:pPr>
+        <w:pStyle w:val="Normal"/>
+        <w:spacing w:before="0" w:after="0"/>
+        <w:rPr>
           <w:rFonts w:cs="Calibri" w:cstheme="minorHAnsi"/>
           <w:sz w:val="20"/>
           <w:szCs w:val="20"/>
@@ -3464,28 +3554,18 @@
           <w:szCs w:val="20"/>
           <w:lang w:val="pt-PT"/>
         </w:rPr>
-        <w:t>Sandro Gomes</w:t>
-      </w:r>
-    </w:p>
-    <w:p>
-      <w:pPr>
-        <w:pStyle w:val="Normal"/>
-        <w:spacing w:lineRule="auto" w:line="240" w:beforeAutospacing="1" w:afterAutospacing="1"/>
-        <w:ind w:left="567"/>
-        <w:rPr>
-          <w:rFonts w:ascii="Cambria" w:hAnsi="Cambria" w:eastAsia="Calibri" w:cs="Times New Roman"/>
-          <w:b/>
-          <w:sz w:val="36"/>
-          <w:szCs w:val="36"/>
-        </w:rPr>
-      </w:pPr>
-      <w:r>
-        <w:rPr>
-          <w:rFonts w:eastAsia="Calibri" w:cs="Times New Roman" w:ascii="Cambria" w:hAnsi="Cambria"/>
-          <w:b/>
-          <w:sz w:val="36"/>
-          <w:szCs w:val="36"/>
-        </w:rPr>
+        <w:t>q3</w:t>
+      </w:r>
+      <w:r>
+        <w:rPr>
+          <w:rFonts w:eastAsia="Calibri" w:cs="Calibri" w:cstheme="minorHAnsi"/>
+          <w:b/>
+          <w:i/>
+          <w:sz w:val="20"/>
+          <w:szCs w:val="20"/>
+          <w:lang w:val="pt-PT"/>
+        </w:rPr>
+        <w:t>4</w:t>
       </w:r>
     </w:p>
     <w:p>
@@ -3662,7 +3742,7 @@
           <w:szCs w:val="20"/>
           <w:lang w:val="pt-PT"/>
         </w:rPr>
-        <w:t>Moises Figueiró</w:t>
+        <w:t>Moises Figueiro</w:t>
       </w:r>
     </w:p>
     <w:p>
@@ -3789,8 +3869,8 @@
         <w:tblLook w:firstRow="1" w:noVBand="1" w:lastRow="0" w:firstColumn="1" w:lastColumn="0" w:noHBand="0" w:val="04a0"/>
       </w:tblPr>
       <w:tblGrid>
-        <w:gridCol w:w="5147"/>
-        <w:gridCol w:w="2581"/>
+        <w:gridCol w:w="5148"/>
+        <w:gridCol w:w="2580"/>
         <w:gridCol w:w="2522"/>
       </w:tblGrid>
       <w:tr>
@@ -3799,7 +3879,7 @@
         </w:trPr>
         <w:tc>
           <w:tcPr>
-            <w:tcW w:w="5147" w:type="dxa"/>
+            <w:tcW w:w="5148" w:type="dxa"/>
             <w:tcBorders>
               <w:top w:val="nil"/>
               <w:left w:val="nil"/>
@@ -3839,7 +3919,7 @@
         </w:tc>
         <w:tc>
           <w:tcPr>
-            <w:tcW w:w="2581" w:type="dxa"/>
+            <w:tcW w:w="2580" w:type="dxa"/>
             <w:tcBorders>
               <w:top w:val="nil"/>
               <w:left w:val="nil"/>
@@ -3965,8 +4045,6 @@
         <w:tab/>
         <w:tab/>
         <w:t xml:space="preserve"> </w:t>
-        <w:tab/>
-        <w:tab/>
       </w:r>
       <w:r>
         <w:rPr>
@@ -4239,17 +4317,19 @@
         </w:rPr>
         <w:tab/>
         <w:tab/>
-      </w:r>
-      <w:r>
-        <w:rPr>
-          <w:rFonts w:eastAsia="Calibri" w:cs="Calibri" w:cstheme="minorHAnsi"/>
-          <w:b/>
-          <w:i/>
-          <w:sz w:val="20"/>
-          <w:szCs w:val="20"/>
-          <w:lang w:val="pt-PT"/>
-        </w:rPr>
-        <w:t xml:space="preserve"> Rómulo Marques</w:t>
+        <w:tab/>
+        <w:tab/>
+      </w:r>
+      <w:r>
+        <w:rPr>
+          <w:rFonts w:eastAsia="Calibri" w:cs="Calibri" w:cstheme="minorHAnsi"/>
+          <w:b/>
+          <w:i/>
+          <w:sz w:val="20"/>
+          <w:szCs w:val="20"/>
+          <w:lang w:val="pt-PT"/>
+        </w:rPr>
+        <w:t xml:space="preserve"> Romulo Marques</w:t>
       </w:r>
     </w:p>
     <w:tbl>
@@ -4425,99 +4505,11 @@
           <w:rFonts w:eastAsia="Calibri" w:cs="Calibri" w:cstheme="minorHAnsi"/>
           <w:b/>
           <w:bCs/>
-          <w:color w:val="auto"/>
-          <w:kern w:val="0"/>
-          <w:sz w:val="22"/>
-          <w:szCs w:val="22"/>
-          <w:lang w:val="pt-BR" w:eastAsia="en-US" w:bidi="ar-SA"/>
-        </w:rPr>
-        <w:t xml:space="preserve"> Iniciando conversas</w:t>
-      </w:r>
-      <w:r>
-        <w:rPr>
-          <w:rFonts w:cs="Calibri" w:cstheme="minorHAnsi"/>
-          <w:sz w:val="22"/>
-          <w:szCs w:val="22"/>
-        </w:rPr>
-        <w:tab/>
-      </w:r>
-      <w:r>
-        <w:rPr>
-          <w:rFonts w:cs="Calibri" w:cstheme="minorHAnsi"/>
-          <w:sz w:val="20"/>
-          <w:szCs w:val="20"/>
-        </w:rPr>
-        <w:tab/>
-        <w:tab/>
-      </w:r>
-      <w:r>
-        <w:rPr>
-          <w:rFonts w:cs="Calibri" w:ascii="Calibri;serif" w:hAnsi="Calibri;serif" w:cstheme="minorHAnsi"/>
-          <w:b/>
-          <w:color w:val="575A5D"/>
-          <w:sz w:val="16"/>
-          <w:szCs w:val="16"/>
-        </w:rPr>
-        <w:t>Estudante/Ajudante:</w:t>
-      </w:r>
-      <w:r>
-        <w:rPr>
-          <w:rFonts w:cs="Calibri" w:cstheme="minorHAnsi"/>
-          <w:sz w:val="20"/>
-          <w:szCs w:val="20"/>
-        </w:rPr>
-        <w:tab/>
-        <w:tab/>
-        <w:tab/>
+          <w:color w:val="575A5D"/>
+          <w:sz w:val="20"/>
+          <w:szCs w:val="20"/>
+        </w:rPr>
         <w:t xml:space="preserve"> </w:t>
-      </w:r>
-      <w:r>
-        <w:rPr>
-          <w:rFonts w:eastAsia="Calibri" w:cs="Calibri" w:cstheme="minorHAnsi"/>
-          <w:b/>
-          <w:i/>
-          <w:sz w:val="20"/>
-          <w:szCs w:val="20"/>
-          <w:lang w:val="pt-PT"/>
-        </w:rPr>
-        <w:t>Glaucia Gomes  / Gabriela Silva</w:t>
-      </w:r>
-    </w:p>
-    <w:p>
-      <w:pPr>
-        <w:pStyle w:val="Normal"/>
-        <w:spacing w:before="0" w:after="0"/>
-        <w:rPr>
-          <w:rFonts w:cs="Calibri" w:cstheme="minorHAnsi"/>
-          <w:sz w:val="20"/>
-          <w:szCs w:val="20"/>
-        </w:rPr>
-      </w:pPr>
-      <w:r>
-        <w:rPr>
-          <w:rFonts w:eastAsia="Calibri" w:cs="Calibri" w:cstheme="minorHAnsi"/>
-          <w:b/>
-          <w:color w:val="575A5D"/>
-        </w:rPr>
-        <w:t>4:00</w:t>
-      </w:r>
-      <w:r>
-        <w:rPr>
-          <w:rFonts w:cs="Calibri" w:cstheme="minorHAnsi"/>
-          <w:sz w:val="20"/>
-          <w:szCs w:val="20"/>
-        </w:rPr>
-        <w:tab/>
-      </w:r>
-      <w:r>
-        <w:rPr>
-          <w:rFonts w:eastAsia="Calibri" w:cs="Calibri" w:cstheme="minorHAnsi"/>
-          <w:b/>
-          <w:color w:val="575A5D"/>
-          <w:sz w:val="20"/>
-          <w:szCs w:val="20"/>
-        </w:rPr>
-        <w:t>5.</w:t>
       </w:r>
       <w:r>
         <w:rPr>
@@ -4530,7 +4522,7 @@
           <w:szCs w:val="22"/>
           <w:lang w:val="pt-BR" w:eastAsia="en-US" w:bidi="ar-SA"/>
         </w:rPr>
-        <w:t xml:space="preserve"> Cultivando o interesse</w:t>
+        <w:t>4. Iniciando conversas</w:t>
       </w:r>
       <w:r>
         <w:rPr>
@@ -4565,21 +4557,20 @@
           <w:szCs w:val="20"/>
         </w:rPr>
         <w:tab/>
+        <w:tab/>
+        <w:tab/>
         <w:t xml:space="preserve"> </w:t>
-        <w:tab/>
-        <w:tab/>
-        <w:t xml:space="preserve"> </w:t>
-      </w:r>
-      <w:r>
-        <w:rPr>
-          <w:rFonts w:eastAsia="Calibri" w:cs="Calibri" w:cstheme="minorHAnsi"/>
-          <w:b/>
-          <w:i/>
-          <w:sz w:val="20"/>
-          <w:szCs w:val="20"/>
-          <w:lang w:val="pt-PT"/>
-        </w:rPr>
-        <w:t>Marleide Mirandola  / Maria Modesta</w:t>
+      </w:r>
+      <w:r>
+        <w:rPr>
+          <w:rFonts w:eastAsia="Calibri" w:cs="Calibri" w:cstheme="minorHAnsi"/>
+          <w:b/>
+          <w:i/>
+          <w:sz w:val="20"/>
+          <w:szCs w:val="20"/>
+          <w:lang w:val="pt-PT"/>
+        </w:rPr>
+        <w:t>Glaucia Gomes  / Gabriela Silva</w:t>
       </w:r>
     </w:p>
     <w:p>
@@ -4598,25 +4589,25 @@
           <w:b/>
           <w:color w:val="575A5D"/>
         </w:rPr>
-        <w:t>5:00</w:t>
-      </w:r>
-      <w:r>
-        <w:rPr>
-          <w:rFonts w:cs="Calibri" w:cstheme="minorHAnsi"/>
-          <w:sz w:val="20"/>
-          <w:szCs w:val="20"/>
-        </w:rPr>
-        <w:tab/>
-      </w:r>
-      <w:r>
-        <w:rPr>
-          <w:rFonts w:eastAsia="Calibri" w:cs="Calibri" w:cstheme="minorHAnsi"/>
-          <w:b/>
-          <w:color w:val="575A5D"/>
-          <w:sz w:val="20"/>
-          <w:szCs w:val="20"/>
-        </w:rPr>
-        <w:t>6.</w:t>
+        <w:t>4:00</w:t>
+      </w:r>
+      <w:r>
+        <w:rPr>
+          <w:rFonts w:cs="Calibri" w:cstheme="minorHAnsi"/>
+          <w:sz w:val="20"/>
+          <w:szCs w:val="20"/>
+        </w:rPr>
+        <w:tab/>
+      </w:r>
+      <w:r>
+        <w:rPr>
+          <w:rFonts w:eastAsia="Calibri" w:cs="Calibri" w:cstheme="minorHAnsi"/>
+          <w:b/>
+          <w:color w:val="575A5D"/>
+          <w:sz w:val="20"/>
+          <w:szCs w:val="20"/>
+        </w:rPr>
+        <w:t xml:space="preserve">5. </w:t>
       </w:r>
       <w:r>
         <w:rPr>
@@ -4629,7 +4620,106 @@
           <w:szCs w:val="22"/>
           <w:lang w:val="pt-BR" w:eastAsia="en-US" w:bidi="ar-SA"/>
         </w:rPr>
-        <w:t xml:space="preserve"> Explicando suas crenças</w:t>
+        <w:t>5. Cultivando o interesse</w:t>
+      </w:r>
+      <w:r>
+        <w:rPr>
+          <w:rFonts w:cs="Calibri" w:cstheme="minorHAnsi"/>
+          <w:sz w:val="22"/>
+          <w:szCs w:val="22"/>
+        </w:rPr>
+        <w:tab/>
+      </w:r>
+      <w:r>
+        <w:rPr>
+          <w:rFonts w:cs="Calibri" w:cstheme="minorHAnsi"/>
+          <w:sz w:val="20"/>
+          <w:szCs w:val="20"/>
+        </w:rPr>
+        <w:tab/>
+      </w:r>
+      <w:r>
+        <w:rPr>
+          <w:rFonts w:cs="Calibri" w:ascii="Calibri;serif" w:hAnsi="Calibri;serif" w:cstheme="minorHAnsi"/>
+          <w:b/>
+          <w:color w:val="575A5D"/>
+          <w:sz w:val="16"/>
+          <w:szCs w:val="16"/>
+        </w:rPr>
+        <w:t>Estudante/Ajudante:</w:t>
+      </w:r>
+      <w:r>
+        <w:rPr>
+          <w:rFonts w:cs="Calibri" w:cstheme="minorHAnsi"/>
+          <w:sz w:val="20"/>
+          <w:szCs w:val="20"/>
+        </w:rPr>
+        <w:tab/>
+        <w:t xml:space="preserve"> </w:t>
+        <w:tab/>
+        <w:tab/>
+        <w:t xml:space="preserve"> </w:t>
+      </w:r>
+      <w:r>
+        <w:rPr>
+          <w:rFonts w:eastAsia="Calibri" w:cs="Calibri" w:cstheme="minorHAnsi"/>
+          <w:b/>
+          <w:i/>
+          <w:sz w:val="20"/>
+          <w:szCs w:val="20"/>
+          <w:lang w:val="pt-PT"/>
+        </w:rPr>
+        <w:t>Marleide Mirandola  / Maria Modesta</w:t>
+      </w:r>
+    </w:p>
+    <w:p>
+      <w:pPr>
+        <w:pStyle w:val="Normal"/>
+        <w:spacing w:before="0" w:after="0"/>
+        <w:rPr>
+          <w:rFonts w:cs="Calibri" w:cstheme="minorHAnsi"/>
+          <w:sz w:val="20"/>
+          <w:szCs w:val="20"/>
+        </w:rPr>
+      </w:pPr>
+      <w:r>
+        <w:rPr>
+          <w:rFonts w:eastAsia="Calibri" w:cs="Calibri" w:cstheme="minorHAnsi"/>
+          <w:b/>
+          <w:color w:val="575A5D"/>
+        </w:rPr>
+        <w:t>5:00</w:t>
+      </w:r>
+      <w:r>
+        <w:rPr>
+          <w:rFonts w:cs="Calibri" w:cstheme="minorHAnsi"/>
+          <w:sz w:val="20"/>
+          <w:szCs w:val="20"/>
+        </w:rPr>
+        <w:tab/>
+      </w:r>
+      <w:r>
+        <w:rPr>
+          <w:rFonts w:eastAsia="Calibri" w:cs="Calibri" w:cstheme="minorHAnsi"/>
+          <w:b/>
+          <w:color w:val="575A5D"/>
+          <w:sz w:val="20"/>
+          <w:szCs w:val="20"/>
+        </w:rPr>
+        <w:t xml:space="preserve">6. </w:t>
+      </w:r>
+      <w:r>
+        <w:rPr>
+          <w:rFonts w:eastAsia="Calibri" w:cs="Calibri" w:cstheme="minorHAnsi"/>
+          <w:b/>
+          <w:bCs/>
+          <w:color w:val="auto"/>
+          <w:kern w:val="0"/>
+          <w:sz w:val="22"/>
+          <w:szCs w:val="22"/>
+          <w:lang w:val="pt-BR" w:eastAsia="en-US" w:bidi="ar-SA"/>
+        </w:rPr>
+        <w:t>6. Explicando suas crenças</w:t>
       </w:r>
       <w:r>
         <w:rPr>
@@ -4680,6 +4770,130 @@
           <w:lang w:val="pt-PT"/>
         </w:rPr>
         <w:t xml:space="preserve"> Marla Moraes  / Jesuslene Lobo</w:t>
+      </w:r>
+    </w:p>
+    <w:p>
+      <w:pPr>
+        <w:pStyle w:val="Normal"/>
+        <w:spacing w:before="0" w:after="0"/>
+        <w:rPr>
+          <w:rFonts w:cs="Calibri" w:cstheme="minorHAnsi"/>
+          <w:sz w:val="20"/>
+          <w:szCs w:val="20"/>
+        </w:rPr>
+      </w:pPr>
+      <w:r>
+        <w:rPr>
+          <w:rFonts w:eastAsia="Calibri" w:cs="Calibri" w:cstheme="minorHAnsi"/>
+          <w:b/>
+          <w:i/>
+          <w:color w:val="575A5D"/>
+          <w:sz w:val="20"/>
+          <w:szCs w:val="20"/>
+          <w:lang w:val="pt-PT"/>
+        </w:rPr>
+        <w:t>5:00</w:t>
+      </w:r>
+      <w:r>
+        <w:rPr>
+          <w:rFonts w:eastAsia="Calibri" w:cs="Calibri" w:cstheme="minorHAnsi"/>
+          <w:b/>
+          <w:i/>
+          <w:sz w:val="20"/>
+          <w:szCs w:val="20"/>
+          <w:lang w:val="pt-PT"/>
+        </w:rPr>
+        <w:tab/>
+      </w:r>
+      <w:r>
+        <w:rPr>
+          <w:rFonts w:eastAsia="Calibri" w:cs="Calibri" w:cstheme="minorHAnsi"/>
+          <w:b/>
+          <w:i/>
+          <w:color w:val="575A5D"/>
+          <w:kern w:val="0"/>
+          <w:sz w:val="20"/>
+          <w:szCs w:val="20"/>
+          <w:lang w:val="pt-BR" w:eastAsia="en-US" w:bidi="ar-SA"/>
+        </w:rPr>
+        <w:t>7.</w:t>
+      </w:r>
+      <w:r>
+        <w:rPr>
+          <w:rFonts w:eastAsia="Calibri" w:cs="Calibri" w:cstheme="minorHAnsi"/>
+          <w:b/>
+          <w:i/>
+          <w:color w:val="575A5D"/>
+          <w:sz w:val="20"/>
+          <w:szCs w:val="20"/>
+          <w:lang w:val="pt-PT"/>
+        </w:rPr>
+        <w:t xml:space="preserve"> </w:t>
+      </w:r>
+      <w:r>
+        <w:rPr>
+          <w:rFonts w:eastAsia="Calibri" w:cs="Calibri" w:cstheme="minorHAnsi"/>
+          <w:b/>
+          <w:bCs/>
+          <w:i/>
+          <w:color w:val="auto"/>
+          <w:kern w:val="0"/>
+          <w:sz w:val="22"/>
+          <w:szCs w:val="22"/>
+          <w:lang w:val="pt-BR" w:eastAsia="en-US" w:bidi="ar-SA"/>
+        </w:rPr>
+        <w:t>não possui</w:t>
+      </w:r>
+      <w:r>
+        <w:rPr>
+          <w:rFonts w:eastAsia="Calibri" w:cs="Calibri" w:cstheme="minorHAnsi"/>
+          <w:b/>
+          <w:bCs/>
+          <w:i/>
+          <w:sz w:val="22"/>
+          <w:szCs w:val="22"/>
+          <w:lang w:val="pt-PT"/>
+        </w:rPr>
+        <w:tab/>
+      </w:r>
+      <w:r>
+        <w:rPr>
+          <w:rFonts w:eastAsia="Calibri" w:cs="Calibri" w:cstheme="minorHAnsi"/>
+          <w:b/>
+          <w:i/>
+          <w:sz w:val="20"/>
+          <w:szCs w:val="20"/>
+          <w:lang w:val="pt-PT"/>
+        </w:rPr>
+        <w:tab/>
+      </w:r>
+      <w:r>
+        <w:rPr>
+          <w:rFonts w:eastAsia="Calibri" w:cs="Calibri" w:ascii="Calibri;serif" w:hAnsi="Calibri;serif" w:cstheme="minorHAnsi"/>
+          <w:b/>
+          <w:i/>
+          <w:color w:val="575A5D"/>
+          <w:sz w:val="16"/>
+          <w:szCs w:val="16"/>
+          <w:lang w:val="pt-PT"/>
+        </w:rPr>
+        <w:t>Estudante/Ajudante:</w:t>
+      </w:r>
+      <w:r>
+        <w:rPr>
+          <w:rFonts w:eastAsia="Calibri" w:cs="Calibri" w:cstheme="minorHAnsi"/>
+          <w:b/>
+          <w:i/>
+          <w:sz w:val="20"/>
+          <w:szCs w:val="20"/>
+          <w:lang w:val="pt-PT"/>
+        </w:rPr>
+        <w:tab/>
+        <w:t xml:space="preserve"> </w:t>
+        <w:tab/>
+        <w:tab/>
+        <w:t>não possui</w:t>
+        <w:tab/>
       </w:r>
     </w:p>
     <w:tbl>
@@ -4837,32 +5051,9 @@
           <w:b/>
           <w:color w:val="575A5D"/>
         </w:rPr>
-        <w:t>1</w:t>
-      </w:r>
-      <w:r>
-        <w:rPr>
-          <w:rFonts w:eastAsia="Calibri" w:cs="Times New Roman"/>
-          <w:b/>
-          <w:color w:val="575A5D"/>
-        </w:rPr>
-        <w:t>5</w:t>
-      </w:r>
-      <w:r>
-        <w:rPr>
-          <w:rFonts w:eastAsia="Calibri" w:cs="Times New Roman"/>
-          <w:b/>
-          <w:color w:val="575A5D"/>
-        </w:rPr>
-        <w:t>:00</w:t>
-        <w:tab/>
-      </w:r>
-      <w:r>
-        <w:rPr>
-          <w:rFonts w:eastAsia="Calibri" w:cs="Times New Roman"/>
-          <w:b/>
-          <w:color w:val="575A5D"/>
-        </w:rPr>
-        <w:t>7.</w:t>
+        <w:t>10:00</w:t>
+        <w:tab/>
+        <w:t>•</w:t>
       </w:r>
       <w:r>
         <w:rPr>
@@ -4874,21 +5065,44 @@
           <w:szCs w:val="22"/>
           <w:lang w:val="af-ZA" w:bidi="ta-IN"/>
         </w:rPr>
-        <w:t xml:space="preserve">Confie plenamente em Jeová ao se preparar para um tratamento médico </w:t>
-        <w:tab/>
-        <w:tab/>
-      </w:r>
-      <w:r>
-        <w:rPr>
-          <w:rFonts w:eastAsia="Calibri" w:cs="Calibri" w:cstheme="minorHAnsi"/>
+        <w:t>7. Confie plenamente em Jeová ao se preparar para um tratamento médico ou uma cirurgia</w:t>
+        <w:tab/>
+      </w:r>
+      <w:r>
+        <w:rPr>
+          <w:rFonts w:eastAsia="Calibri" w:cs="Times New Roman"/>
           <w:b/>
           <w:bCs/>
           <w:i/>
-          <w:sz w:val="20"/>
-          <w:szCs w:val="20"/>
+          <w:sz w:val="24"/>
+          <w:szCs w:val="24"/>
+          <w:lang w:val="af-ZA" w:bidi="ta-IN"/>
+        </w:rPr>
+        <w:tab/>
+      </w:r>
+      <w:r>
+        <w:rPr>
+          <w:rFonts w:eastAsia="Calibri" w:cs="Calibri"/>
+          <w:b/>
+          <w:bCs/>
+          <w:i/>
+          <w:sz w:val="24"/>
+          <w:szCs w:val="24"/>
           <w:lang w:val="pt-PT" w:bidi="ta-IN"/>
         </w:rPr>
-        <w:t>Rogério Silva</w:t>
+        <w:t xml:space="preserve"> </w:t>
+      </w:r>
+      <w:r>
+        <w:rPr>
+          <w:rFonts w:eastAsia="Calibri" w:cs="Calibri" w:cstheme="minorHAnsi"/>
+          <w:b/>
+          <w:bCs/>
+          <w:i/>
+          <w:sz w:val="20"/>
+          <w:szCs w:val="20"/>
+          <w:lang w:val="pt-PT" w:bidi="ta-IN"/>
+        </w:rPr>
+        <w:t>Rogerio Silva</w:t>
       </w:r>
     </w:p>
     <w:p>
@@ -4909,16 +5123,9 @@
           <w:b/>
           <w:color w:val="575A5D"/>
         </w:rPr>
-        <w:t>30:00</w:t>
-        <w:tab/>
-      </w:r>
-      <w:r>
-        <w:rPr>
-          <w:rFonts w:eastAsia="Calibri" w:cs="Times New Roman"/>
-          <w:b/>
-          <w:color w:val="575A5D"/>
-        </w:rPr>
-        <w:t>8.</w:t>
+        <w:t>5:00</w:t>
+        <w:tab/>
+        <w:t>•</w:t>
       </w:r>
       <w:r>
         <w:rPr>
@@ -4930,7 +5137,7 @@
           <w:szCs w:val="22"/>
           <w:lang w:val="af-ZA" w:bidi="ta-IN"/>
         </w:rPr>
-        <w:t>Estudo bíblico de congregação lfb histórias 54-55</w:t>
+        <w:t>não possue esta Parte</w:t>
       </w:r>
       <w:r>
         <w:rPr>
@@ -4957,9 +5164,7 @@
           <w:szCs w:val="20"/>
           <w:lang w:val="pt-PT"/>
         </w:rPr>
-        <w:t xml:space="preserve"> </w:t>
-        <w:tab/>
-        <w:t>Luiz Czarnos  / Wanderson Souza</w:t>
+        <w:t xml:space="preserve"> não possui</w:t>
       </w:r>
     </w:p>
     <w:p>
@@ -4967,9 +5172,11 @@
         <w:pStyle w:val="Normal"/>
         <w:spacing w:before="0" w:after="0"/>
         <w:rPr>
-          <w:rFonts w:cs="Calibri" w:cstheme="minorHAnsi"/>
-          <w:sz w:val="20"/>
-          <w:szCs w:val="20"/>
+          <w:rFonts w:ascii="Calibri" w:hAnsi="Calibri" w:eastAsia="Calibri" w:cs="Calibri"/>
+          <w:b/>
+          <w:i/>
+          <w:i/>
+          <w:lang w:val="pt-PT"/>
         </w:rPr>
       </w:pPr>
       <w:r>
@@ -4978,18 +5185,48 @@
           <w:b/>
           <w:color w:val="575A5D"/>
         </w:rPr>
-        <w:t>3:00</w:t>
+        <w:t>30:00</w:t>
         <w:tab/>
         <w:t>•</w:t>
       </w:r>
       <w:r>
         <w:rPr>
-          <w:rFonts w:cs="Calibri" w:cstheme="minorHAnsi"/>
-          <w:sz w:val="20"/>
-          <w:szCs w:val="20"/>
-        </w:rPr>
-        <w:t>Comentários finais (3 min)</w:t>
-        <w:tab/>
+          <w:rFonts w:eastAsia="Calibri" w:cs="Times New Roman"/>
+          <w:b/>
+          <w:bCs/>
+          <w:i/>
+          <w:sz w:val="22"/>
+          <w:szCs w:val="22"/>
+          <w:lang w:val="af-ZA" w:bidi="ta-IN"/>
+        </w:rPr>
+        <w:t>8. Estudo bíblico de congregação lfb histórias 54-55</w:t>
+      </w:r>
+      <w:r>
+        <w:rPr>
+          <w:rFonts w:cs="Calibri" w:cstheme="minorHAnsi"/>
+          <w:sz w:val="22"/>
+          <w:szCs w:val="22"/>
+        </w:rPr>
+        <w:tab/>
+      </w:r>
+      <w:r>
+        <w:rPr>
+          <w:rFonts w:cs="Calibri" w:cstheme="minorHAnsi"/>
+          <w:sz w:val="20"/>
+          <w:szCs w:val="20"/>
+        </w:rPr>
+        <w:tab/>
+      </w:r>
+      <w:r>
+        <w:rPr>
+          <w:rFonts w:eastAsia="Calibri" w:cs="Calibri" w:cstheme="minorHAnsi"/>
+          <w:b/>
+          <w:i/>
+          <w:sz w:val="20"/>
+          <w:szCs w:val="20"/>
+          <w:lang w:val="pt-PT"/>
+        </w:rPr>
+        <w:t xml:space="preserve"> Luiz Czarnos  / Wanderson Souza</w:t>
       </w:r>
     </w:p>
     <w:p>
@@ -4997,6 +5234,36 @@
         <w:pStyle w:val="Normal"/>
         <w:spacing w:before="0" w:after="0"/>
         <w:rPr>
+          <w:rFonts w:cs="Calibri" w:cstheme="minorHAnsi"/>
+          <w:sz w:val="20"/>
+          <w:szCs w:val="20"/>
+        </w:rPr>
+      </w:pPr>
+      <w:r>
+        <w:rPr>
+          <w:rFonts w:eastAsia="Calibri" w:cs="Times New Roman"/>
+          <w:b/>
+          <w:color w:val="575A5D"/>
+        </w:rPr>
+        <w:t>3:00</w:t>
+        <w:tab/>
+        <w:t>•</w:t>
+      </w:r>
+      <w:r>
+        <w:rPr>
+          <w:rFonts w:cs="Calibri" w:cstheme="minorHAnsi"/>
+          <w:sz w:val="20"/>
+          <w:szCs w:val="20"/>
+        </w:rPr>
+        <w:t>Comentários finais (3 min)</w:t>
+        <w:tab/>
+      </w:r>
+    </w:p>
+    <w:p>
+      <w:pPr>
+        <w:pStyle w:val="Normal"/>
+        <w:spacing w:before="0" w:after="0"/>
+        <w:rPr>
           <w:rFonts w:ascii="Calibri" w:hAnsi="Calibri" w:eastAsia="Calibri" w:cs="Calibri"/>
           <w:b/>
           <w:i/>
@@ -5063,7 +5330,18 @@
           <w:szCs w:val="20"/>
           <w:lang w:val="pt-PT"/>
         </w:rPr>
-        <w:t>Moises Figueiró</w:t>
+        <w:t>r3</w:t>
+      </w:r>
+      <w:r>
+        <w:rPr>
+          <w:rFonts w:eastAsia="Calibri" w:cs="Calibri" w:cstheme="minorHAnsi"/>
+          <w:b/>
+          <w:i/>
+          <w:sz w:val="20"/>
+          <w:szCs w:val="20"/>
+          <w:lang w:val="pt-PT"/>
+        </w:rPr>
+        <w:t>4</w:t>
       </w:r>
     </w:p>
     <w:p>
@@ -5165,6 +5443,9 @@
         <w:t xml:space="preserve">                                          </w:t>
         <w:tab/>
         <w:tab/>
+        <w:tab/>
+        <w:tab/>
+        <w:t xml:space="preserve"> </w:t>
       </w:r>
       <w:r>
         <w:rPr>
@@ -5191,7 +5472,7 @@
           <w:szCs w:val="20"/>
           <w:lang w:val="pt-BR"/>
         </w:rPr>
-        <w:t>Maurício Cardozo</w:t>
+        <w:t>Mauricio Cardozo</w:t>
       </w:r>
     </w:p>
     <w:p>
@@ -5318,8 +5599,8 @@
         <w:tblLook w:firstRow="1" w:noVBand="1" w:lastRow="0" w:firstColumn="1" w:lastColumn="0" w:noHBand="0" w:val="04a0"/>
       </w:tblPr>
       <w:tblGrid>
-        <w:gridCol w:w="5147"/>
-        <w:gridCol w:w="2581"/>
+        <w:gridCol w:w="5148"/>
+        <w:gridCol w:w="2580"/>
         <w:gridCol w:w="2522"/>
       </w:tblGrid>
       <w:tr>
@@ -5328,7 +5609,7 @@
         </w:trPr>
         <w:tc>
           <w:tcPr>
-            <w:tcW w:w="5147" w:type="dxa"/>
+            <w:tcW w:w="5148" w:type="dxa"/>
             <w:tcBorders>
               <w:top w:val="nil"/>
               <w:left w:val="nil"/>
@@ -5368,7 +5649,7 @@
         </w:tc>
         <w:tc>
           <w:tcPr>
-            <w:tcW w:w="2581" w:type="dxa"/>
+            <w:tcW w:w="2580" w:type="dxa"/>
             <w:tcBorders>
               <w:top w:val="nil"/>
               <w:left w:val="nil"/>
@@ -5490,17 +5771,20 @@
         </w:rPr>
         <w:t xml:space="preserve">        </w:t>
         <w:tab/>
-      </w:r>
-      <w:r>
-        <w:rPr>
-          <w:rFonts w:eastAsia="Calibri" w:cs="Calibri" w:cstheme="minorHAnsi"/>
-          <w:b/>
-          <w:i/>
-          <w:sz w:val="20"/>
-          <w:szCs w:val="20"/>
-          <w:lang w:val="pt-PT"/>
-        </w:rPr>
-        <w:t xml:space="preserve"> Moises Figueiró</w:t>
+        <w:tab/>
+        <w:tab/>
+        <w:tab/>
+      </w:r>
+      <w:r>
+        <w:rPr>
+          <w:rFonts w:eastAsia="Calibri" w:cs="Calibri" w:cstheme="minorHAnsi"/>
+          <w:b/>
+          <w:i/>
+          <w:sz w:val="20"/>
+          <w:szCs w:val="20"/>
+          <w:lang w:val="pt-PT"/>
+        </w:rPr>
+        <w:t xml:space="preserve"> Moises Figueiro</w:t>
       </w:r>
     </w:p>
     <w:p>
@@ -5753,17 +6037,20 @@
         </w:rPr>
         <w:tab/>
         <w:tab/>
-      </w:r>
-      <w:r>
-        <w:rPr>
-          <w:rFonts w:eastAsia="Calibri" w:cs="Calibri" w:cstheme="minorHAnsi"/>
-          <w:b/>
-          <w:i/>
-          <w:sz w:val="20"/>
-          <w:szCs w:val="20"/>
-          <w:lang w:val="pt-PT"/>
-        </w:rPr>
-        <w:t>Alyson Gomes</w:t>
+        <w:tab/>
+        <w:tab/>
+        <w:tab/>
+      </w:r>
+      <w:r>
+        <w:rPr>
+          <w:rFonts w:eastAsia="Calibri" w:cs="Calibri" w:cstheme="minorHAnsi"/>
+          <w:b/>
+          <w:i/>
+          <w:sz w:val="20"/>
+          <w:szCs w:val="20"/>
+          <w:lang w:val="pt-PT"/>
+        </w:rPr>
+        <w:t xml:space="preserve"> Alyson Gomes</w:t>
       </w:r>
     </w:p>
     <w:tbl>
@@ -5914,15 +6201,7 @@
           <w:b/>
           <w:color w:val="575A5D"/>
         </w:rPr>
-        <w:t>2</w:t>
-      </w:r>
-      <w:r>
-        <w:rPr>
-          <w:rFonts w:eastAsia="Calibri" w:cs="Calibri" w:cstheme="minorHAnsi"/>
-          <w:b/>
-          <w:color w:val="575A5D"/>
-        </w:rPr>
-        <w:t>:00</w:t>
+        <w:t>3:00</w:t>
       </w:r>
       <w:r>
         <w:rPr>
@@ -5941,6 +6220,17 @@
           <w:szCs w:val="20"/>
         </w:rPr>
         <w:t>4.</w:t>
+      </w:r>
+      <w:r>
+        <w:rPr>
+          <w:rFonts w:eastAsia="Calibri" w:cs="Calibri" w:cstheme="minorHAnsi"/>
+          <w:b/>
+          <w:bCs/>
+          <w:color w:val="575A5D"/>
+          <w:sz w:val="20"/>
+          <w:szCs w:val="20"/>
+        </w:rPr>
+        <w:t xml:space="preserve"> </w:t>
       </w:r>
       <w:r>
         <w:rPr>
@@ -5953,7 +6243,7 @@
           <w:szCs w:val="22"/>
           <w:lang w:val="pt-BR" w:eastAsia="en-US" w:bidi="ar-SA"/>
         </w:rPr>
-        <w:t xml:space="preserve"> Iniciando conversas</w:t>
+        <w:t>4. Iniciando conversas</w:t>
       </w:r>
       <w:r>
         <w:rPr>
@@ -5970,7 +6260,6 @@
           <w:szCs w:val="20"/>
         </w:rPr>
         <w:tab/>
-        <w:tab/>
       </w:r>
       <w:r>
         <w:rPr>
@@ -6001,29 +6290,7 @@
           <w:szCs w:val="20"/>
           <w:lang w:val="pt-PT"/>
         </w:rPr>
-        <w:t xml:space="preserve"> Alana </w:t>
-      </w:r>
-      <w:r>
-        <w:rPr>
-          <w:rFonts w:eastAsia="Calibri" w:cs="Calibri" w:cstheme="minorHAnsi"/>
-          <w:b/>
-          <w:i/>
-          <w:sz w:val="20"/>
-          <w:szCs w:val="20"/>
-          <w:lang w:val="pt-PT"/>
-        </w:rPr>
-        <w:t>Moraes</w:t>
-      </w:r>
-      <w:r>
-        <w:rPr>
-          <w:rFonts w:eastAsia="Calibri" w:cs="Calibri" w:cstheme="minorHAnsi"/>
-          <w:b/>
-          <w:i/>
-          <w:sz w:val="20"/>
-          <w:szCs w:val="20"/>
-          <w:lang w:val="pt-PT"/>
-        </w:rPr>
-        <w:t xml:space="preserve">  / Diana Moraes</w:t>
+        <w:t xml:space="preserve"> Alana Moraes  / Diana Moraes</w:t>
       </w:r>
     </w:p>
     <w:p>
@@ -6042,33 +6309,25 @@
           <w:b/>
           <w:color w:val="575A5D"/>
         </w:rPr>
-        <w:t>3</w:t>
-      </w:r>
-      <w:r>
-        <w:rPr>
-          <w:rFonts w:eastAsia="Calibri" w:cs="Calibri" w:cstheme="minorHAnsi"/>
-          <w:b/>
-          <w:color w:val="575A5D"/>
-        </w:rPr>
-        <w:t>:00</w:t>
-      </w:r>
-      <w:r>
-        <w:rPr>
-          <w:rFonts w:cs="Calibri" w:cstheme="minorHAnsi"/>
-          <w:sz w:val="20"/>
-          <w:szCs w:val="20"/>
-        </w:rPr>
-        <w:tab/>
-      </w:r>
-      <w:r>
-        <w:rPr>
-          <w:rFonts w:eastAsia="Calibri" w:cs="Calibri" w:cstheme="minorHAnsi"/>
-          <w:b/>
-          <w:color w:val="575A5D"/>
-          <w:sz w:val="20"/>
-          <w:szCs w:val="20"/>
-        </w:rPr>
-        <w:t>5.</w:t>
+        <w:t>4:00</w:t>
+      </w:r>
+      <w:r>
+        <w:rPr>
+          <w:rFonts w:cs="Calibri" w:cstheme="minorHAnsi"/>
+          <w:sz w:val="20"/>
+          <w:szCs w:val="20"/>
+        </w:rPr>
+        <w:tab/>
+      </w:r>
+      <w:r>
+        <w:rPr>
+          <w:rFonts w:eastAsia="Calibri" w:cs="Calibri" w:cstheme="minorHAnsi"/>
+          <w:b/>
+          <w:color w:val="575A5D"/>
+          <w:sz w:val="20"/>
+          <w:szCs w:val="20"/>
+        </w:rPr>
+        <w:t xml:space="preserve">5. </w:t>
       </w:r>
       <w:r>
         <w:rPr>
@@ -6081,7 +6340,7 @@
           <w:szCs w:val="22"/>
           <w:lang w:val="pt-BR" w:eastAsia="en-US" w:bidi="ar-SA"/>
         </w:rPr>
-        <w:t xml:space="preserve"> Cultivando o interesse</w:t>
+        <w:t>5. Cultivando o interesse</w:t>
       </w:r>
       <w:r>
         <w:rPr>
@@ -6098,6 +6357,7 @@
           <w:szCs w:val="20"/>
         </w:rPr>
         <w:tab/>
+        <w:t xml:space="preserve"> </w:t>
       </w:r>
       <w:r>
         <w:rPr>
@@ -6128,7 +6388,7 @@
           <w:szCs w:val="20"/>
           <w:lang w:val="pt-PT"/>
         </w:rPr>
-        <w:t xml:space="preserve"> Rodrigo Ng / Lucas Jorge</w:t>
+        <w:t xml:space="preserve"> Rodrigo Ng  / Lucas Jorge</w:t>
       </w:r>
     </w:p>
     <w:p>
@@ -6147,33 +6407,25 @@
           <w:b/>
           <w:color w:val="575A5D"/>
         </w:rPr>
-        <w:t>2</w:t>
-      </w:r>
-      <w:r>
-        <w:rPr>
-          <w:rFonts w:eastAsia="Calibri" w:cs="Calibri" w:cstheme="minorHAnsi"/>
-          <w:b/>
-          <w:color w:val="575A5D"/>
-        </w:rPr>
-        <w:t>:00</w:t>
-      </w:r>
-      <w:r>
-        <w:rPr>
-          <w:rFonts w:cs="Calibri" w:cstheme="minorHAnsi"/>
-          <w:sz w:val="20"/>
-          <w:szCs w:val="20"/>
-        </w:rPr>
-        <w:tab/>
-      </w:r>
-      <w:r>
-        <w:rPr>
-          <w:rFonts w:eastAsia="Calibri" w:cs="Calibri" w:cstheme="minorHAnsi"/>
-          <w:b/>
-          <w:color w:val="575A5D"/>
-          <w:sz w:val="20"/>
-          <w:szCs w:val="20"/>
-        </w:rPr>
-        <w:t>6.</w:t>
+        <w:t>5:00</w:t>
+      </w:r>
+      <w:r>
+        <w:rPr>
+          <w:rFonts w:cs="Calibri" w:cstheme="minorHAnsi"/>
+          <w:sz w:val="20"/>
+          <w:szCs w:val="20"/>
+        </w:rPr>
+        <w:tab/>
+      </w:r>
+      <w:r>
+        <w:rPr>
+          <w:rFonts w:eastAsia="Calibri" w:cs="Calibri" w:cstheme="minorHAnsi"/>
+          <w:b/>
+          <w:color w:val="575A5D"/>
+          <w:sz w:val="20"/>
+          <w:szCs w:val="20"/>
+        </w:rPr>
+        <w:t xml:space="preserve">6. </w:t>
       </w:r>
       <w:r>
         <w:rPr>
@@ -6186,7 +6438,7 @@
           <w:szCs w:val="22"/>
           <w:lang w:val="pt-BR" w:eastAsia="en-US" w:bidi="ar-SA"/>
         </w:rPr>
-        <w:t xml:space="preserve"> Fazendo discípulos</w:t>
+        <w:t>6. Fazendo discípulos</w:t>
       </w:r>
       <w:r>
         <w:rPr>
@@ -6206,7 +6458,6 @@
         </w:rPr>
         <w:tab/>
         <w:t xml:space="preserve"> </w:t>
-        <w:tab/>
       </w:r>
       <w:r>
         <w:rPr>
@@ -6260,19 +6511,7 @@
           <w:szCs w:val="20"/>
           <w:lang w:val="pt-PT"/>
         </w:rPr>
-        <w:t>4</w:t>
-      </w:r>
-      <w:r>
-        <w:rPr>
-          <w:rFonts w:eastAsia="Calibri" w:cs="Calibri" w:cstheme="minorHAnsi"/>
-          <w:b/>
-          <w:i/>
-          <w:color w:val="575A5D"/>
-          <w:sz w:val="20"/>
-          <w:szCs w:val="20"/>
-          <w:lang w:val="pt-PT"/>
-        </w:rPr>
-        <w:t>:00</w:t>
+        <w:t>5:00</w:t>
       </w:r>
       <w:r>
         <w:rPr>
@@ -6297,6 +6536,18 @@
           <w:lang w:val="pt-BR" w:eastAsia="en-US" w:bidi="ar-SA"/>
         </w:rPr>
         <w:t>7.</w:t>
+      </w:r>
+      <w:r>
+        <w:rPr>
+          <w:rFonts w:eastAsia="Calibri" w:cs="Calibri" w:cstheme="minorHAnsi"/>
+          <w:b/>
+          <w:i/>
+          <w:color w:val="575A5D"/>
+          <w:sz w:val="20"/>
+          <w:szCs w:val="20"/>
+          <w:lang w:val="pt-PT"/>
+        </w:rPr>
+        <w:t xml:space="preserve"> </w:t>
       </w:r>
       <w:r>
         <w:rPr>
@@ -6310,7 +6561,7 @@
           <w:szCs w:val="22"/>
           <w:lang w:val="pt-BR" w:eastAsia="en-US" w:bidi="ar-SA"/>
         </w:rPr>
-        <w:t xml:space="preserve"> Fazendo discípulos</w:t>
+        <w:t>7. Fazendo discípulos</w:t>
       </w:r>
       <w:r>
         <w:rPr>
@@ -6334,7 +6585,6 @@
           <w:lang w:val="pt-PT"/>
         </w:rPr>
         <w:tab/>
-        <w:tab/>
       </w:r>
       <w:r>
         <w:rPr>
@@ -6361,28 +6611,7 @@
         <w:t xml:space="preserve"> </w:t>
         <w:tab/>
         <w:tab/>
-        <w:t xml:space="preserve">Marcio Conceição / Stefani </w:t>
-      </w:r>
-      <w:r>
-        <w:rPr>
-          <w:rFonts w:eastAsia="Calibri" w:cs="Calibri" w:cstheme="minorHAnsi"/>
-          <w:b/>
-          <w:i/>
-          <w:sz w:val="20"/>
-          <w:szCs w:val="20"/>
-          <w:lang w:val="pt-PT"/>
-        </w:rPr>
-        <w:t>Conceição</w:t>
-      </w:r>
-      <w:r>
-        <w:rPr>
-          <w:rFonts w:eastAsia="Calibri" w:cs="Calibri" w:cstheme="minorHAnsi"/>
-          <w:b/>
-          <w:i/>
-          <w:sz w:val="20"/>
-          <w:szCs w:val="20"/>
-          <w:lang w:val="pt-PT"/>
-        </w:rPr>
+        <w:t>Marcio Conceicao  / Stafane Conceicao</w:t>
         <w:tab/>
       </w:r>
     </w:p>
@@ -6541,24 +6770,9 @@
           <w:b/>
           <w:color w:val="575A5D"/>
         </w:rPr>
-        <w:t>8</w:t>
-      </w:r>
-      <w:r>
-        <w:rPr>
-          <w:rFonts w:eastAsia="Calibri" w:cs="Times New Roman"/>
-          <w:b/>
-          <w:color w:val="575A5D"/>
-        </w:rPr>
-        <w:t>:00</w:t>
-        <w:tab/>
-      </w:r>
-      <w:r>
-        <w:rPr>
-          <w:rFonts w:eastAsia="Calibri" w:cs="Times New Roman"/>
-          <w:b/>
-          <w:color w:val="575A5D"/>
-        </w:rPr>
-        <w:t>8.</w:t>
+        <w:t>10:00</w:t>
+        <w:tab/>
+        <w:t>•</w:t>
       </w:r>
       <w:r>
         <w:rPr>
@@ -6570,7 +6784,7 @@
           <w:szCs w:val="22"/>
           <w:lang w:val="af-ZA" w:bidi="ta-IN"/>
         </w:rPr>
-        <w:t xml:space="preserve"> “Faço sempre o que lhe agrada”</w:t>
+        <w:t>8. “Faço sempre o que lhe agrada”</w:t>
       </w:r>
       <w:r>
         <w:rPr>
@@ -6597,10 +6811,6 @@
           <w:szCs w:val="20"/>
           <w:lang w:val="pt-PT"/>
         </w:rPr>
-        <w:t xml:space="preserve"> </w:t>
-        <w:tab/>
-        <w:tab/>
-        <w:tab/>
         <w:t xml:space="preserve"> Sandro Gomes</w:t>
       </w:r>
     </w:p>
@@ -6622,24 +6832,9 @@
           <w:b/>
           <w:color w:val="575A5D"/>
         </w:rPr>
-        <w:t>7</w:t>
-      </w:r>
-      <w:r>
-        <w:rPr>
-          <w:rFonts w:eastAsia="Calibri" w:cs="Times New Roman"/>
-          <w:b/>
-          <w:color w:val="575A5D"/>
-        </w:rPr>
-        <w:t>:00</w:t>
-        <w:tab/>
-      </w:r>
-      <w:r>
-        <w:rPr>
-          <w:rFonts w:eastAsia="Calibri" w:cs="Times New Roman"/>
-          <w:b/>
-          <w:color w:val="575A5D"/>
-        </w:rPr>
-        <w:t>9.</w:t>
+        <w:t>5:00</w:t>
+        <w:tab/>
+        <w:t>•</w:t>
       </w:r>
       <w:r>
         <w:rPr>
@@ -6651,7 +6846,7 @@
           <w:szCs w:val="22"/>
           <w:lang w:val="af-ZA" w:bidi="ta-IN"/>
         </w:rPr>
-        <w:t xml:space="preserve"> Necessidades locais</w:t>
+        <w:t>9. Necessidades locais</w:t>
       </w:r>
       <w:r>
         <w:rPr>
@@ -6678,12 +6873,6 @@
           <w:szCs w:val="20"/>
           <w:lang w:val="pt-PT"/>
         </w:rPr>
-        <w:t xml:space="preserve"> </w:t>
-        <w:tab/>
-        <w:tab/>
-        <w:tab/>
-        <w:tab/>
-        <w:tab/>
         <w:t xml:space="preserve"> Welinghton Carvalho</w:t>
       </w:r>
     </w:p>
@@ -6707,14 +6896,7 @@
         </w:rPr>
         <w:t>30:00</w:t>
         <w:tab/>
-      </w:r>
-      <w:r>
-        <w:rPr>
-          <w:rFonts w:eastAsia="Calibri" w:cs="Times New Roman"/>
-          <w:b/>
-          <w:color w:val="575A5D"/>
-        </w:rPr>
-        <w:t>10.</w:t>
+        <w:t>•</w:t>
       </w:r>
       <w:r>
         <w:rPr>
@@ -6726,7 +6908,7 @@
           <w:szCs w:val="22"/>
           <w:lang w:val="af-ZA" w:bidi="ta-IN"/>
         </w:rPr>
-        <w:t>Estudo bíblico de congregação lfb história 56, intro 10 e história 57</w:t>
+        <w:t>10. Estudo bíblico de congregação lfb história 56, introdução da seção 10 e história 57</w:t>
       </w:r>
       <w:r>
         <w:rPr>
@@ -6738,14 +6920,22 @@
       </w:r>
       <w:r>
         <w:rPr>
-          <w:rFonts w:eastAsia="Calibri" w:cs="Calibri" w:cstheme="minorHAnsi"/>
-          <w:b/>
-          <w:i/>
-          <w:sz w:val="20"/>
-          <w:szCs w:val="20"/>
-          <w:lang w:val="pt-PT"/>
-        </w:rPr>
-        <w:t xml:space="preserve"> Rogério Silva  / Alexsander Gomes</w:t>
+          <w:rFonts w:cs="Calibri" w:cstheme="minorHAnsi"/>
+          <w:sz w:val="20"/>
+          <w:szCs w:val="20"/>
+        </w:rPr>
+        <w:tab/>
+      </w:r>
+      <w:r>
+        <w:rPr>
+          <w:rFonts w:eastAsia="Calibri" w:cs="Calibri" w:cstheme="minorHAnsi"/>
+          <w:b/>
+          <w:i/>
+          <w:sz w:val="20"/>
+          <w:szCs w:val="20"/>
+          <w:lang w:val="pt-PT"/>
+        </w:rPr>
+        <w:t xml:space="preserve"> Rogerio Silva  / Alexsander Gomes</w:t>
       </w:r>
     </w:p>
     <w:p>
@@ -6849,18 +7039,18 @@
           <w:szCs w:val="20"/>
           <w:lang w:val="pt-PT"/>
         </w:rPr>
-        <w:t xml:space="preserve"> </w:t>
-      </w:r>
-      <w:r>
-        <w:rPr>
-          <w:rFonts w:eastAsia="Calibri" w:cs="Calibri" w:cstheme="minorHAnsi"/>
-          <w:b/>
-          <w:i/>
-          <w:sz w:val="20"/>
-          <w:szCs w:val="20"/>
-          <w:lang w:val="pt-BR"/>
-        </w:rPr>
-        <w:t>Maurício Cardozo</w:t>
+        <w:t xml:space="preserve"> s3</w:t>
+      </w:r>
+      <w:r>
+        <w:rPr>
+          <w:rFonts w:eastAsia="Calibri" w:cs="Calibri" w:cstheme="minorHAnsi"/>
+          <w:b/>
+          <w:i/>
+          <w:sz w:val="20"/>
+          <w:szCs w:val="20"/>
+          <w:lang w:val="pt-PT"/>
+        </w:rPr>
+        <w:t>4</w:t>
       </w:r>
     </w:p>
     <w:p>
@@ -6876,13 +7066,1802 @@
         </w:rPr>
       </w:pPr>
       <w:r>
+        <w:rPr>
+          <w:rFonts w:eastAsia="Calibri" w:cs="Times New Roman" w:ascii="Cambria" w:hAnsi="Cambria"/>
+          <w:b/>
+          <w:sz w:val="36"/>
+          <w:szCs w:val="36"/>
+        </w:rPr>
+        <w:t>Programação da reunião do meio de semana</w:t>
+      </w:r>
+    </w:p>
+    <w:p>
+      <w:pPr>
+        <w:pStyle w:val="Normal"/>
+        <w:spacing w:lineRule="auto" w:line="240" w:before="0" w:after="60"/>
         <w:rPr/>
+      </w:pPr>
+      <w:r>
+        <w:rPr>
+          <w:rFonts w:eastAsia="Calibri" w:cs="Times New Roman"/>
+          <w:b/>
+          <w:i/>
+          <w:color w:val="FF0000"/>
+        </w:rPr>
+        <w:t>Congregação  Rasas Praias 143644</w:t>
+      </w:r>
+      <w:r>
+        <w:rPr/>
+        <w:tab/>
+      </w:r>
+    </w:p>
+    <w:p>
+      <w:pPr>
+        <w:pStyle w:val="Normal"/>
+        <w:rPr/>
+      </w:pPr>
+      <w:r>
+        <w:rPr/>
+        <w:drawing>
+          <wp:inline distT="0" distB="0" distL="0" distR="0">
+            <wp:extent cx="5400040" cy="90170"/>
+            <wp:effectExtent l="0" t="0" r="0" b="0"/>
+            <wp:docPr id="5" name="Imagem 3" descr=""/>
+            <wp:cNvGraphicFramePr>
+              <a:graphicFrameLocks xmlns:a="http://schemas.openxmlformats.org/drawingml/2006/main" noChangeAspect="1"/>
+            </wp:cNvGraphicFramePr>
+            <a:graphic xmlns:a="http://schemas.openxmlformats.org/drawingml/2006/main">
+              <a:graphicData uri="http://schemas.openxmlformats.org/drawingml/2006/picture">
+                <pic:pic xmlns:pic="http://schemas.openxmlformats.org/drawingml/2006/picture">
+                  <pic:nvPicPr>
+                    <pic:cNvPr id="5" name="Imagem 3" descr=""/>
+                    <pic:cNvPicPr>
+                      <a:picLocks noChangeAspect="1" noChangeArrowheads="1"/>
+                    </pic:cNvPicPr>
+                  </pic:nvPicPr>
+                  <pic:blipFill>
+                    <a:blip r:embed="rId6"/>
+                    <a:stretch>
+                      <a:fillRect/>
+                    </a:stretch>
+                  </pic:blipFill>
+                  <pic:spPr bwMode="auto">
+                    <a:xfrm>
+                      <a:off x="0" y="0"/>
+                      <a:ext cx="5400040" cy="90170"/>
+                    </a:xfrm>
+                    <a:prstGeom prst="rect">
+                      <a:avLst/>
+                    </a:prstGeom>
+                    <a:noFill/>
+                  </pic:spPr>
+                </pic:pic>
+              </a:graphicData>
+            </a:graphic>
+          </wp:inline>
+        </w:drawing>
+      </w:r>
+    </w:p>
+    <w:p>
+      <w:pPr>
+        <w:pStyle w:val="Normal"/>
+        <w:spacing w:lineRule="auto" w:line="240" w:before="0" w:after="240"/>
+        <w:rPr>
+          <w:rFonts w:ascii="Calibri" w:hAnsi="Calibri" w:eastAsia="Calibri" w:cs="Calibri"/>
+          <w:b/>
+          <w:i/>
+          <w:i/>
+          <w:lang w:val="pt-PT"/>
+        </w:rPr>
+      </w:pPr>
+      <w:r>
+        <w:rPr>
+          <w:rFonts w:cs="Calibri" w:cstheme="minorHAnsi"/>
+          <w:sz w:val="20"/>
+          <w:szCs w:val="20"/>
+        </w:rPr>
+        <w:t xml:space="preserve"> </w:t>
+      </w:r>
+      <w:r>
+        <w:rPr>
+          <w:rFonts w:eastAsia="Calibri" w:cs="Times New Roman"/>
+          <w:b/>
+          <w:bCs/>
+          <w:i/>
+          <w:color w:val="FF0000"/>
+        </w:rPr>
+        <w:t>t01</w:t>
+      </w:r>
+      <w:r>
+        <w:rPr>
+          <w:rFonts w:cs="Calibri" w:cstheme="minorHAnsi"/>
+          <w:sz w:val="20"/>
+          <w:szCs w:val="20"/>
+        </w:rPr>
+        <w:t xml:space="preserve"> </w:t>
+      </w:r>
+      <w:r>
+        <w:rPr>
+          <w:rFonts w:eastAsia="Times New Roman"/>
+          <w:b/>
+          <w:bCs/>
+          <w:i/>
+          <w:iCs/>
+          <w:color w:val="0000FF"/>
+          <w:lang w:val="af-ZA" w:bidi="ta-IN"/>
+        </w:rPr>
+        <w:t xml:space="preserve">t02 </w:t>
+      </w:r>
+      <w:r>
+        <w:rPr>
+          <w:rFonts w:cs="Calibri" w:cstheme="minorHAnsi"/>
+          <w:sz w:val="20"/>
+          <w:szCs w:val="20"/>
+        </w:rPr>
+        <w:t xml:space="preserve">                                           </w:t>
+        <w:tab/>
+        <w:tab/>
+        <w:tab/>
+        <w:tab/>
+      </w:r>
+      <w:r>
+        <w:rPr>
+          <w:rFonts w:eastAsia="Calibri" w:cs="Times New Roman"/>
+          <w:b/>
+          <w:color w:val="575A5D"/>
+        </w:rPr>
+        <w:t>Presidente:</w:t>
+      </w:r>
+      <w:r>
+        <w:rPr>
+          <w:rFonts w:cs="Calibri" w:cstheme="minorHAnsi"/>
+          <w:sz w:val="20"/>
+          <w:szCs w:val="20"/>
+        </w:rPr>
+        <w:t xml:space="preserve"> </w:t>
+      </w:r>
+      <w:r>
+        <w:rPr>
+          <w:rFonts w:eastAsia="Calibri" w:cs="Calibri" w:cstheme="minorHAnsi"/>
+          <w:b/>
+          <w:i/>
+          <w:sz w:val="20"/>
+          <w:szCs w:val="20"/>
+          <w:lang w:val="pt-PT"/>
+        </w:rPr>
+        <w:t xml:space="preserve"> t34</w:t>
+      </w:r>
+    </w:p>
+    <w:p>
+      <w:pPr>
+        <w:pStyle w:val="Normal"/>
+        <w:spacing w:before="0" w:after="0"/>
+        <w:rPr>
+          <w:rFonts w:ascii="Calibri" w:hAnsi="Calibri" w:eastAsia="Calibri" w:cs="Calibri"/>
+          <w:b/>
+          <w:i/>
+          <w:i/>
+          <w:lang w:val="pt-PT"/>
+        </w:rPr>
+      </w:pPr>
+      <w:r>
+        <w:rPr>
+          <w:rFonts w:eastAsia="Calibri" w:cs="Times New Roman"/>
+          <w:b/>
+          <w:color w:val="575A5D"/>
+        </w:rPr>
+        <w:tab/>
+        <w:t>•</w:t>
+      </w:r>
+      <w:r>
+        <w:rPr>
+          <w:rFonts w:cs="Calibri" w:cstheme="minorHAnsi"/>
+          <w:sz w:val="20"/>
+          <w:szCs w:val="20"/>
+        </w:rPr>
+        <w:t xml:space="preserve"> </w:t>
+      </w:r>
+      <w:r>
+        <w:rPr>
+          <w:rStyle w:val="Strong"/>
+          <w:rFonts w:eastAsia="Times New Roman" w:cs="Latha" w:ascii="Calibri Light" w:hAnsi="Calibri Light" w:asciiTheme="majorHAnsi" w:hAnsiTheme="majorHAnsi"/>
+          <w:i/>
+          <w:color w:val="0000FF"/>
+          <w:lang w:val="af-ZA" w:bidi="ta-IN"/>
+        </w:rPr>
+        <w:t>t03</w:t>
+      </w:r>
+      <w:r>
+        <w:rPr>
+          <w:rFonts w:cs="Calibri" w:cstheme="minorHAnsi"/>
+          <w:sz w:val="20"/>
+          <w:szCs w:val="20"/>
+        </w:rPr>
+        <w:tab/>
+        <w:tab/>
+        <w:tab/>
+        <w:tab/>
+        <w:tab/>
+        <w:tab/>
+        <w:tab/>
+      </w:r>
+      <w:r>
+        <w:rPr>
+          <w:rFonts w:eastAsia="Calibri" w:cs="Times New Roman"/>
+          <w:b/>
+          <w:color w:val="575A5D"/>
+        </w:rPr>
+        <w:t>Oração:</w:t>
+      </w:r>
+      <w:r>
+        <w:rPr>
+          <w:rFonts w:cs="Calibri" w:cstheme="minorHAnsi"/>
+          <w:sz w:val="20"/>
+          <w:szCs w:val="20"/>
+        </w:rPr>
+        <w:t xml:space="preserve"> </w:t>
+      </w:r>
+      <w:r>
+        <w:rPr>
+          <w:rFonts w:eastAsia="Calibri" w:cs="Calibri" w:cstheme="minorHAnsi"/>
+          <w:b/>
+          <w:i/>
+          <w:sz w:val="20"/>
+          <w:szCs w:val="20"/>
+          <w:lang w:val="pt-PT"/>
+        </w:rPr>
+        <w:t xml:space="preserve"> t35</w:t>
+      </w:r>
+    </w:p>
+    <w:p>
+      <w:pPr>
+        <w:pStyle w:val="Normal"/>
+        <w:spacing w:lineRule="auto" w:line="240" w:before="0" w:after="0"/>
+        <w:rPr>
+          <w:rFonts w:cs="Calibri" w:cstheme="minorHAnsi"/>
+          <w:sz w:val="20"/>
+          <w:szCs w:val="20"/>
+        </w:rPr>
+      </w:pPr>
+      <w:r>
+        <w:rPr>
+          <w:rFonts w:eastAsia="Calibri" w:cs="Times New Roman"/>
+          <w:b/>
+          <w:color w:val="575A5D"/>
+        </w:rPr>
+        <w:t>1:00</w:t>
+        <w:tab/>
+        <w:t>•</w:t>
+      </w:r>
+      <w:r>
+        <w:rPr>
+          <w:rFonts w:cs="Calibri" w:cstheme="minorHAnsi"/>
+          <w:sz w:val="20"/>
+          <w:szCs w:val="20"/>
+        </w:rPr>
+        <w:t>Comentários iniciais (1 min)</w:t>
+      </w:r>
+    </w:p>
+    <w:tbl>
+      <w:tblPr>
+        <w:tblStyle w:val="Tabelacomgrade1"/>
+        <w:tblW w:w="10250" w:type="dxa"/>
+        <w:jc w:val="left"/>
+        <w:tblInd w:w="0" w:type="dxa"/>
+        <w:tblLayout w:type="fixed"/>
+        <w:tblCellMar>
+          <w:top w:w="0" w:type="dxa"/>
+          <w:left w:w="108" w:type="dxa"/>
+          <w:bottom w:w="0" w:type="dxa"/>
+          <w:right w:w="108" w:type="dxa"/>
+        </w:tblCellMar>
+        <w:tblLook w:firstRow="1" w:noVBand="1" w:lastRow="0" w:firstColumn="1" w:lastColumn="0" w:noHBand="0" w:val="04a0"/>
+      </w:tblPr>
+      <w:tblGrid>
+        <w:gridCol w:w="5148"/>
+        <w:gridCol w:w="2580"/>
+        <w:gridCol w:w="2522"/>
+      </w:tblGrid>
+      <w:tr>
+        <w:trPr>
+          <w:trHeight w:val="288" w:hRule="atLeast"/>
+        </w:trPr>
+        <w:tc>
+          <w:tcPr>
+            <w:tcW w:w="5148" w:type="dxa"/>
+            <w:tcBorders>
+              <w:top w:val="nil"/>
+              <w:left w:val="nil"/>
+              <w:bottom w:val="nil"/>
+              <w:right w:val="nil"/>
+            </w:tcBorders>
+            <w:shd w:color="auto" w:fill="575A5D" w:val="clear"/>
+            <w:vAlign w:val="center"/>
+          </w:tcPr>
+          <w:p>
+            <w:pPr>
+              <w:pStyle w:val="Normal"/>
+              <w:widowControl/>
+              <w:suppressAutoHyphens w:val="true"/>
+              <w:spacing w:lineRule="auto" w:line="240" w:before="0" w:after="0"/>
+              <w:jc w:val="left"/>
+              <w:rPr>
+                <w:b/>
+                <w:sz w:val="20"/>
+                <w:szCs w:val="20"/>
+                <w:lang w:val="pt-BR"/>
+              </w:rPr>
+            </w:pPr>
+            <w:r>
+              <w:rPr>
+                <w:rFonts w:eastAsia="Calibri" w:cs="Times New Roman"/>
+                <w:b/>
+                <w:color w:val="FFFFFF"/>
+                <w:kern w:val="0"/>
+                <w:sz w:val="20"/>
+                <w:szCs w:val="20"/>
+                <w:lang w:val="pt-BR" w:eastAsia="en-US" w:bidi="ar-SA"/>
+              </w:rPr>
+              <w:t>TESOUTOS DA PALAVRA DE DEUS</w:t>
+            </w:r>
+          </w:p>
+        </w:tc>
+        <w:tc>
+          <w:tcPr>
+            <w:tcW w:w="2580" w:type="dxa"/>
+            <w:tcBorders>
+              <w:top w:val="nil"/>
+              <w:left w:val="nil"/>
+              <w:bottom w:val="nil"/>
+              <w:right w:val="nil"/>
+            </w:tcBorders>
+            <w:vAlign w:val="bottom"/>
+          </w:tcPr>
+          <w:p>
+            <w:pPr>
+              <w:pStyle w:val="Normal"/>
+              <w:widowControl/>
+              <w:suppressAutoHyphens w:val="true"/>
+              <w:spacing w:lineRule="auto" w:line="240" w:before="0" w:after="120"/>
+              <w:jc w:val="left"/>
+              <w:rPr>
+                <w:sz w:val="20"/>
+                <w:szCs w:val="20"/>
+                <w:lang w:val="pt-BR"/>
+              </w:rPr>
+            </w:pPr>
+            <w:r>
+              <w:rPr>
+                <w:sz w:val="20"/>
+                <w:szCs w:val="20"/>
+                <w:lang w:val="pt-BR"/>
+              </w:rPr>
+            </w:r>
+          </w:p>
+        </w:tc>
+        <w:tc>
+          <w:tcPr>
+            <w:tcW w:w="2522" w:type="dxa"/>
+            <w:tcBorders>
+              <w:top w:val="nil"/>
+              <w:left w:val="nil"/>
+              <w:bottom w:val="nil"/>
+              <w:right w:val="nil"/>
+            </w:tcBorders>
+            <w:vAlign w:val="bottom"/>
+          </w:tcPr>
+          <w:p>
+            <w:pPr>
+              <w:pStyle w:val="Normal"/>
+              <w:widowControl/>
+              <w:suppressAutoHyphens w:val="true"/>
+              <w:spacing w:lineRule="auto" w:line="240" w:before="0" w:after="120"/>
+              <w:jc w:val="left"/>
+              <w:rPr>
+                <w:sz w:val="20"/>
+                <w:szCs w:val="20"/>
+                <w:lang w:val="pt-BR"/>
+              </w:rPr>
+            </w:pPr>
+            <w:r>
+              <w:rPr>
+                <w:sz w:val="20"/>
+                <w:szCs w:val="20"/>
+                <w:lang w:val="pt-BR"/>
+              </w:rPr>
+            </w:r>
+          </w:p>
+        </w:tc>
+      </w:tr>
+    </w:tbl>
+    <w:p>
+      <w:pPr>
+        <w:pStyle w:val="Normal"/>
+        <w:spacing w:before="0" w:after="0"/>
+        <w:rPr>
+          <w:rFonts w:ascii="Calibri" w:hAnsi="Calibri" w:eastAsia="Calibri" w:cs="Calibri"/>
+          <w:b/>
+          <w:i/>
+          <w:i/>
+          <w:lang w:val="pt-PT"/>
+        </w:rPr>
+      </w:pPr>
+      <w:r>
+        <w:rPr>
+          <w:rFonts w:eastAsia="Calibri" w:cs="Times New Roman"/>
+          <w:b/>
+          <w:color w:val="575A5D"/>
+        </w:rPr>
+        <w:t xml:space="preserve">10:00    </w:t>
+        <w:tab/>
+      </w:r>
+      <w:r>
+        <w:rPr>
+          <w:rFonts w:eastAsia="Calibri" w:cs="Calibri" w:cstheme="minorHAnsi"/>
+          <w:b/>
+          <w:color w:val="575A5D"/>
+          <w:sz w:val="20"/>
+          <w:szCs w:val="20"/>
+        </w:rPr>
+        <w:t>1.</w:t>
+      </w:r>
+      <w:r>
+        <w:rPr>
+          <w:rFonts w:cs="Calibri" w:cstheme="minorHAnsi"/>
+          <w:sz w:val="20"/>
+          <w:szCs w:val="20"/>
+        </w:rPr>
+        <w:t xml:space="preserve"> </w:t>
+      </w:r>
+      <w:r>
+        <w:rPr>
+          <w:rFonts w:eastAsia="Times New Roman" w:cs="Calibri" w:cstheme="minorHAnsi"/>
+          <w:b/>
+          <w:bCs/>
+          <w:i/>
+          <w:color w:val="0000FF"/>
+          <w:lang w:val="af-ZA" w:bidi="ta-IN"/>
+        </w:rPr>
+        <w:t>t06</w:t>
+      </w:r>
+      <w:r>
+        <w:rPr>
+          <w:rFonts w:cs="Calibri" w:cstheme="minorHAnsi"/>
+          <w:sz w:val="20"/>
+          <w:szCs w:val="20"/>
+        </w:rPr>
+        <w:t xml:space="preserve">        </w:t>
+        <w:tab/>
+        <w:tab/>
+        <w:tab/>
+        <w:tab/>
+      </w:r>
+      <w:r>
+        <w:rPr>
+          <w:rFonts w:eastAsia="Calibri" w:cs="Calibri" w:cstheme="minorHAnsi"/>
+          <w:b/>
+          <w:i/>
+          <w:sz w:val="20"/>
+          <w:szCs w:val="20"/>
+          <w:lang w:val="pt-PT"/>
+        </w:rPr>
+        <w:t xml:space="preserve"> t36</w:t>
+      </w:r>
+    </w:p>
+    <w:p>
+      <w:pPr>
+        <w:pStyle w:val="Normal"/>
+        <w:spacing w:before="0" w:after="0"/>
+        <w:rPr>
+          <w:rFonts w:ascii="Calibri" w:hAnsi="Calibri" w:eastAsia="Calibri" w:cs="Calibri"/>
+          <w:b/>
+          <w:i/>
+          <w:i/>
+          <w:lang w:val="pt-PT"/>
+        </w:rPr>
+      </w:pPr>
+      <w:r>
+        <w:rPr>
+          <w:rFonts w:cs="Calibri" w:cstheme="minorHAnsi"/>
+          <w:sz w:val="20"/>
+          <w:szCs w:val="20"/>
+        </w:rPr>
+        <w:tab/>
+        <w:tab/>
+      </w:r>
+      <w:r>
+        <w:rPr>
+          <w:rFonts w:eastAsia="Calibri" w:cs="Calibri" w:cstheme="minorHAnsi"/>
+          <w:b/>
+          <w:color w:val="575A5D"/>
+          <w:kern w:val="0"/>
+          <w:sz w:val="20"/>
+          <w:szCs w:val="20"/>
+          <w:lang w:val="pt-BR" w:eastAsia="en-US" w:bidi="ar-SA"/>
+        </w:rPr>
+        <w:t>2.</w:t>
+      </w:r>
+      <w:r>
+        <w:rPr>
+          <w:rFonts w:cs="Calibri" w:cstheme="minorHAnsi"/>
+          <w:sz w:val="20"/>
+          <w:szCs w:val="20"/>
+        </w:rPr>
+        <w:t xml:space="preserve"> </w:t>
+      </w:r>
+      <w:r>
+        <w:rPr>
+          <w:rFonts w:eastAsia="Calibri" w:cs="Calibri" w:cstheme="minorHAnsi"/>
+          <w:b/>
+          <w:sz w:val="22"/>
+          <w:szCs w:val="22"/>
+        </w:rPr>
+        <w:t>Encontre</w:t>
+      </w:r>
+      <w:r>
+        <w:rPr>
+          <w:rFonts w:cs="Calibri" w:cstheme="minorHAnsi"/>
+          <w:sz w:val="22"/>
+          <w:szCs w:val="22"/>
+        </w:rPr>
+        <w:t xml:space="preserve"> </w:t>
+      </w:r>
+      <w:r>
+        <w:rPr>
+          <w:rFonts w:eastAsia="Calibri" w:cs="Calibri" w:cstheme="minorHAnsi"/>
+          <w:b/>
+          <w:sz w:val="22"/>
+          <w:szCs w:val="22"/>
+        </w:rPr>
+        <w:t>joias espirituais</w:t>
+        <w:tab/>
+      </w:r>
+      <w:r>
+        <w:rPr>
+          <w:rFonts w:eastAsia="Calibri" w:cs="Calibri" w:cstheme="minorHAnsi"/>
+          <w:b/>
+        </w:rPr>
+        <w:tab/>
+        <w:tab/>
+        <w:tab/>
+        <w:tab/>
+      </w:r>
+      <w:r>
+        <w:rPr>
+          <w:rFonts w:eastAsia="Calibri" w:cs="Calibri" w:cstheme="minorHAnsi"/>
+          <w:b/>
+          <w:i/>
+          <w:sz w:val="20"/>
+          <w:szCs w:val="20"/>
+          <w:lang w:val="pt-PT"/>
+        </w:rPr>
+        <w:t xml:space="preserve"> t37</w:t>
+      </w:r>
+    </w:p>
+    <w:p>
+      <w:pPr>
+        <w:pStyle w:val="Normal"/>
+        <w:spacing w:before="0" w:after="0"/>
+        <w:rPr>
+          <w:rFonts w:cs="Calibri" w:cstheme="minorHAnsi"/>
+          <w:sz w:val="20"/>
+          <w:szCs w:val="20"/>
+        </w:rPr>
+      </w:pPr>
+      <w:r>
+        <w:rPr>
+          <w:rFonts w:eastAsia="Calibri" w:cs="Times New Roman"/>
+          <w:b/>
+          <w:color w:val="575A5D"/>
+        </w:rPr>
+        <w:t xml:space="preserve">10:00  </w:t>
+        <w:tab/>
+        <w:t>•</w:t>
+      </w:r>
+      <w:r>
+        <w:rPr>
+          <w:rFonts w:cs="Calibri" w:cstheme="minorHAnsi"/>
+          <w:sz w:val="20"/>
+          <w:szCs w:val="20"/>
+        </w:rPr>
+        <w:t xml:space="preserve"> </w:t>
+      </w:r>
+      <w:r>
+        <w:rPr>
+          <w:rFonts w:eastAsia="Calibri" w:cs="Calibri" w:cstheme="minorHAnsi"/>
+          <w:b/>
+          <w:bCs/>
+          <w:color w:val="auto"/>
+          <w:kern w:val="0"/>
+          <w:sz w:val="20"/>
+          <w:szCs w:val="20"/>
+          <w:lang w:val="pt-BR" w:eastAsia="en-US" w:bidi="ar-SA"/>
+        </w:rPr>
+        <w:t>t08</w:t>
+      </w:r>
+      <w:r>
+        <w:rPr>
+          <w:rFonts w:cs="Calibri" w:cstheme="minorHAnsi"/>
+          <w:sz w:val="20"/>
+          <w:szCs w:val="20"/>
+        </w:rPr>
+        <w:t xml:space="preserve">   </w:t>
+      </w:r>
+    </w:p>
+    <w:p>
+      <w:pPr>
+        <w:pStyle w:val="Normal"/>
+        <w:spacing w:before="0" w:after="0"/>
+        <w:rPr>
+          <w:rFonts w:ascii="Calibri" w:hAnsi="Calibri" w:eastAsia="Calibri" w:cs="Calibri"/>
+          <w:b/>
+          <w:i/>
+          <w:i/>
+          <w:lang w:val="pt-PT"/>
+        </w:rPr>
+      </w:pPr>
+      <w:r>
+        <w:rPr>
+          <w:rFonts w:eastAsia="Calibri" w:cs="Times New Roman"/>
+          <w:b/>
+          <w:color w:val="575A5D"/>
+        </w:rPr>
+        <w:t>4:00</w:t>
+        <w:tab/>
+      </w:r>
+      <w:r>
+        <w:rPr>
+          <w:rFonts w:eastAsia="Calibri" w:cs="Times New Roman"/>
+          <w:b/>
+          <w:color w:val="575A5D"/>
+          <w:sz w:val="20"/>
+          <w:szCs w:val="20"/>
+        </w:rPr>
+        <w:t>3</w:t>
+      </w:r>
+      <w:r>
+        <w:rPr>
+          <w:rFonts w:eastAsia="Calibri" w:cs="Calibri" w:cstheme="minorHAnsi"/>
+          <w:b/>
+          <w:color w:val="575A5D"/>
+          <w:kern w:val="0"/>
+          <w:sz w:val="20"/>
+          <w:szCs w:val="20"/>
+          <w:lang w:val="pt-BR" w:eastAsia="en-US" w:bidi="ar-SA"/>
+        </w:rPr>
+        <w:t>.</w:t>
+      </w:r>
+      <w:r>
+        <w:rPr>
+          <w:rFonts w:eastAsia="Calibri" w:cs="Calibri" w:cstheme="minorHAnsi"/>
+          <w:b/>
+          <w:sz w:val="20"/>
+          <w:szCs w:val="20"/>
+        </w:rPr>
+        <w:t xml:space="preserve"> </w:t>
+      </w:r>
+      <w:r>
+        <w:rPr>
+          <w:rFonts w:eastAsia="Calibri" w:cs="Calibri" w:cstheme="minorHAnsi"/>
+          <w:b/>
+        </w:rPr>
+        <w:t>Leitura da Bíblia</w:t>
+      </w:r>
+      <w:r>
+        <w:rPr>
+          <w:rFonts w:cs="Calibri" w:cstheme="minorHAnsi"/>
+          <w:b/>
+          <w:bCs/>
+          <w:sz w:val="20"/>
+          <w:szCs w:val="20"/>
+        </w:rPr>
+        <w:t xml:space="preserve"> :</w:t>
+      </w:r>
+      <w:r>
+        <w:rPr>
+          <w:rFonts w:eastAsia="Calibri" w:cs="Calibri" w:cstheme="minorHAnsi"/>
+          <w:b/>
+          <w:color w:val="575A5D"/>
+        </w:rPr>
+        <w:t xml:space="preserve"> </w:t>
+      </w:r>
+      <w:r>
+        <w:rPr>
+          <w:rFonts w:eastAsia="Times New Roman" w:cs="Calibri" w:cstheme="minorHAnsi"/>
+          <w:b/>
+          <w:bCs/>
+          <w:i/>
+          <w:color w:val="0000FF"/>
+          <w:lang w:val="af-ZA" w:bidi="ta-IN"/>
+        </w:rPr>
+        <w:t>t12</w:t>
+      </w:r>
+      <w:r>
+        <w:rPr>
+          <w:rFonts w:cs="Calibri" w:cstheme="minorHAnsi"/>
+          <w:sz w:val="20"/>
+          <w:szCs w:val="20"/>
+        </w:rPr>
+        <w:tab/>
+      </w:r>
+      <w:r>
+        <w:rPr>
+          <w:rFonts w:cs="Calibri" w:ascii="Calibri;serif" w:hAnsi="Calibri;serif" w:cstheme="minorHAnsi"/>
+          <w:b/>
+          <w:color w:val="575A5D"/>
+          <w:sz w:val="16"/>
+          <w:szCs w:val="16"/>
+        </w:rPr>
+        <w:t>Estudante:</w:t>
+      </w:r>
+      <w:r>
+        <w:rPr>
+          <w:rFonts w:cs="Calibri" w:cstheme="minorHAnsi"/>
+          <w:sz w:val="20"/>
+          <w:szCs w:val="20"/>
+        </w:rPr>
+        <w:tab/>
+        <w:tab/>
+        <w:tab/>
+        <w:tab/>
+        <w:tab/>
+      </w:r>
+      <w:r>
+        <w:rPr>
+          <w:rFonts w:eastAsia="Calibri" w:cs="Calibri" w:cstheme="minorHAnsi"/>
+          <w:b/>
+          <w:i/>
+          <w:sz w:val="20"/>
+          <w:szCs w:val="20"/>
+          <w:lang w:val="pt-PT"/>
+        </w:rPr>
+        <w:t xml:space="preserve"> t38</w:t>
+      </w:r>
+    </w:p>
+    <w:tbl>
+      <w:tblPr>
+        <w:tblStyle w:val="Tabelacomgrade1"/>
+        <w:tblW w:w="10211" w:type="dxa"/>
+        <w:jc w:val="left"/>
+        <w:tblInd w:w="0" w:type="dxa"/>
+        <w:tblLayout w:type="fixed"/>
+        <w:tblCellMar>
+          <w:top w:w="0" w:type="dxa"/>
+          <w:left w:w="108" w:type="dxa"/>
+          <w:bottom w:w="0" w:type="dxa"/>
+          <w:right w:w="108" w:type="dxa"/>
+        </w:tblCellMar>
+        <w:tblLook w:firstRow="1" w:noVBand="1" w:lastRow="0" w:firstColumn="1" w:lastColumn="0" w:noHBand="0" w:val="04a0"/>
+      </w:tblPr>
+      <w:tblGrid>
+        <w:gridCol w:w="5145"/>
+        <w:gridCol w:w="2573"/>
+        <w:gridCol w:w="2493"/>
+      </w:tblGrid>
+      <w:tr>
+        <w:trPr>
+          <w:trHeight w:val="288" w:hRule="atLeast"/>
+        </w:trPr>
+        <w:tc>
+          <w:tcPr>
+            <w:tcW w:w="5145" w:type="dxa"/>
+            <w:tcBorders>
+              <w:top w:val="nil"/>
+              <w:left w:val="nil"/>
+              <w:bottom w:val="nil"/>
+              <w:right w:val="nil"/>
+            </w:tcBorders>
+            <w:shd w:color="auto" w:fill="BE8900" w:val="clear"/>
+            <w:vAlign w:val="center"/>
+          </w:tcPr>
+          <w:p>
+            <w:pPr>
+              <w:pStyle w:val="Normal"/>
+              <w:widowControl/>
+              <w:suppressAutoHyphens w:val="true"/>
+              <w:spacing w:lineRule="auto" w:line="240" w:before="0" w:after="0"/>
+              <w:jc w:val="left"/>
+              <w:rPr>
+                <w:b/>
+                <w:sz w:val="20"/>
+                <w:szCs w:val="20"/>
+                <w:lang w:val="pt-BR"/>
+              </w:rPr>
+            </w:pPr>
+            <w:r>
+              <w:rPr>
+                <w:rFonts w:eastAsia="Calibri" w:cs="Times New Roman"/>
+                <w:b/>
+                <w:color w:val="FFFFFF"/>
+                <w:kern w:val="0"/>
+                <w:sz w:val="20"/>
+                <w:szCs w:val="20"/>
+                <w:lang w:val="pt-BR" w:eastAsia="en-US" w:bidi="ar-SA"/>
+              </w:rPr>
+              <w:t>FAÇA SEU MELHOR NO MINISTÉRIO</w:t>
+            </w:r>
+          </w:p>
+        </w:tc>
+        <w:tc>
+          <w:tcPr>
+            <w:tcW w:w="2573" w:type="dxa"/>
+            <w:tcBorders>
+              <w:top w:val="nil"/>
+              <w:left w:val="nil"/>
+              <w:bottom w:val="nil"/>
+              <w:right w:val="nil"/>
+            </w:tcBorders>
+            <w:vAlign w:val="bottom"/>
+          </w:tcPr>
+          <w:p>
+            <w:pPr>
+              <w:pStyle w:val="Normal"/>
+              <w:widowControl/>
+              <w:suppressAutoHyphens w:val="true"/>
+              <w:spacing w:lineRule="auto" w:line="240" w:before="0" w:after="120"/>
+              <w:jc w:val="left"/>
+              <w:rPr>
+                <w:sz w:val="20"/>
+                <w:szCs w:val="20"/>
+                <w:lang w:val="pt-BR"/>
+              </w:rPr>
+            </w:pPr>
+            <w:r>
+              <w:rPr>
+                <w:sz w:val="20"/>
+                <w:szCs w:val="20"/>
+                <w:lang w:val="pt-BR"/>
+              </w:rPr>
+            </w:r>
+          </w:p>
+        </w:tc>
+        <w:tc>
+          <w:tcPr>
+            <w:tcW w:w="2493" w:type="dxa"/>
+            <w:tcBorders>
+              <w:top w:val="nil"/>
+              <w:left w:val="nil"/>
+              <w:bottom w:val="nil"/>
+              <w:right w:val="nil"/>
+            </w:tcBorders>
+            <w:vAlign w:val="bottom"/>
+          </w:tcPr>
+          <w:p>
+            <w:pPr>
+              <w:pStyle w:val="Normal"/>
+              <w:widowControl/>
+              <w:suppressAutoHyphens w:val="true"/>
+              <w:spacing w:lineRule="auto" w:line="240" w:before="0" w:after="120"/>
+              <w:jc w:val="left"/>
+              <w:rPr>
+                <w:sz w:val="20"/>
+                <w:szCs w:val="20"/>
+                <w:lang w:val="pt-BR"/>
+              </w:rPr>
+            </w:pPr>
+            <w:r>
+              <w:rPr>
+                <w:sz w:val="20"/>
+                <w:szCs w:val="20"/>
+                <w:lang w:val="pt-BR"/>
+              </w:rPr>
+            </w:r>
+          </w:p>
+        </w:tc>
+      </w:tr>
+    </w:tbl>
+    <w:p>
+      <w:pPr>
+        <w:pStyle w:val="Normal"/>
+        <w:spacing w:before="0" w:after="0"/>
+        <w:rPr>
+          <w:rFonts w:cs="Calibri" w:cstheme="minorHAnsi"/>
+          <w:sz w:val="20"/>
+          <w:szCs w:val="20"/>
+        </w:rPr>
+      </w:pPr>
+      <w:r>
+        <w:rPr>
+          <w:rFonts w:eastAsia="Calibri" w:cs="Calibri" w:cstheme="minorHAnsi"/>
+          <w:b/>
+          <w:color w:val="575A5D"/>
+        </w:rPr>
+        <w:t>3:00</w:t>
+      </w:r>
+      <w:r>
+        <w:rPr>
+          <w:rFonts w:cs="Calibri" w:cstheme="minorHAnsi"/>
+          <w:sz w:val="20"/>
+          <w:szCs w:val="20"/>
+        </w:rPr>
+        <w:tab/>
+      </w:r>
+      <w:r>
+        <w:rPr>
+          <w:rFonts w:eastAsia="Calibri" w:cs="Calibri" w:cstheme="minorHAnsi"/>
+          <w:b/>
+          <w:color w:val="575A5D"/>
+          <w:sz w:val="20"/>
+          <w:szCs w:val="20"/>
+        </w:rPr>
+        <w:t>4.</w:t>
+      </w:r>
+      <w:r>
+        <w:rPr>
+          <w:rFonts w:eastAsia="Calibri" w:cs="Calibri" w:cstheme="minorHAnsi"/>
+          <w:b/>
+          <w:bCs/>
+          <w:color w:val="575A5D"/>
+          <w:sz w:val="20"/>
+          <w:szCs w:val="20"/>
+        </w:rPr>
+        <w:t xml:space="preserve"> </w:t>
+      </w:r>
+      <w:r>
+        <w:rPr>
+          <w:rFonts w:eastAsia="Calibri" w:cs="Calibri" w:cstheme="minorHAnsi"/>
+          <w:b/>
+          <w:bCs/>
+          <w:color w:val="auto"/>
+          <w:kern w:val="0"/>
+          <w:sz w:val="22"/>
+          <w:szCs w:val="22"/>
+          <w:lang w:val="pt-BR" w:eastAsia="en-US" w:bidi="ar-SA"/>
+        </w:rPr>
+        <w:t>t13</w:t>
+      </w:r>
+      <w:r>
+        <w:rPr>
+          <w:rFonts w:cs="Calibri" w:cstheme="minorHAnsi"/>
+          <w:sz w:val="22"/>
+          <w:szCs w:val="22"/>
+        </w:rPr>
+        <w:tab/>
+      </w:r>
+      <w:r>
+        <w:rPr>
+          <w:rFonts w:cs="Calibri" w:cstheme="minorHAnsi"/>
+          <w:sz w:val="20"/>
+          <w:szCs w:val="20"/>
+        </w:rPr>
+        <w:tab/>
+      </w:r>
+      <w:r>
+        <w:rPr>
+          <w:rFonts w:cs="Calibri" w:ascii="Calibri;serif" w:hAnsi="Calibri;serif" w:cstheme="minorHAnsi"/>
+          <w:b/>
+          <w:color w:val="575A5D"/>
+          <w:sz w:val="16"/>
+          <w:szCs w:val="16"/>
+        </w:rPr>
+        <w:t>Estudante/Ajudante:</w:t>
+      </w:r>
+      <w:r>
+        <w:rPr>
+          <w:rFonts w:cs="Calibri" w:cstheme="minorHAnsi"/>
+          <w:sz w:val="20"/>
+          <w:szCs w:val="20"/>
+        </w:rPr>
+        <w:tab/>
+        <w:tab/>
+        <w:tab/>
+      </w:r>
+      <w:r>
+        <w:rPr>
+          <w:rFonts w:eastAsia="Calibri" w:cs="Calibri" w:cstheme="minorHAnsi"/>
+          <w:b/>
+          <w:i/>
+          <w:sz w:val="20"/>
+          <w:szCs w:val="20"/>
+          <w:lang w:val="pt-BR"/>
+        </w:rPr>
+        <w:t>t39</w:t>
+      </w:r>
+    </w:p>
+    <w:p>
+      <w:pPr>
+        <w:pStyle w:val="Normal"/>
+        <w:spacing w:before="0" w:after="0"/>
+        <w:rPr>
+          <w:rFonts w:cs="Calibri" w:cstheme="minorHAnsi"/>
+          <w:sz w:val="20"/>
+          <w:szCs w:val="20"/>
+        </w:rPr>
+      </w:pPr>
+      <w:r>
+        <w:rPr>
+          <w:rFonts w:eastAsia="Calibri" w:cs="Calibri" w:cstheme="minorHAnsi"/>
+          <w:b/>
+          <w:color w:val="575A5D"/>
+        </w:rPr>
+        <w:t>4:00</w:t>
+      </w:r>
+      <w:r>
+        <w:rPr>
+          <w:rFonts w:cs="Calibri" w:cstheme="minorHAnsi"/>
+          <w:sz w:val="20"/>
+          <w:szCs w:val="20"/>
+        </w:rPr>
+        <w:tab/>
+      </w:r>
+      <w:r>
+        <w:rPr>
+          <w:rFonts w:eastAsia="Calibri" w:cs="Calibri" w:cstheme="minorHAnsi"/>
+          <w:b/>
+          <w:color w:val="575A5D"/>
+          <w:sz w:val="20"/>
+          <w:szCs w:val="20"/>
+        </w:rPr>
+        <w:t xml:space="preserve">5. </w:t>
+      </w:r>
+      <w:r>
+        <w:rPr>
+          <w:rFonts w:eastAsia="Calibri" w:cs="Calibri" w:cstheme="minorHAnsi"/>
+          <w:b/>
+          <w:bCs/>
+          <w:color w:val="auto"/>
+          <w:kern w:val="0"/>
+          <w:sz w:val="22"/>
+          <w:szCs w:val="22"/>
+          <w:lang w:val="pt-BR" w:eastAsia="en-US" w:bidi="ar-SA"/>
+        </w:rPr>
+        <w:t>t14</w:t>
+      </w:r>
+      <w:r>
+        <w:rPr>
+          <w:rFonts w:cs="Calibri" w:cstheme="minorHAnsi"/>
+          <w:sz w:val="22"/>
+          <w:szCs w:val="22"/>
+        </w:rPr>
+        <w:tab/>
+      </w:r>
+      <w:r>
+        <w:rPr>
+          <w:rFonts w:cs="Calibri" w:cstheme="minorHAnsi"/>
+          <w:sz w:val="20"/>
+          <w:szCs w:val="20"/>
+        </w:rPr>
+        <w:tab/>
+      </w:r>
+      <w:r>
+        <w:rPr>
+          <w:rFonts w:cs="Calibri" w:ascii="Calibri;serif" w:hAnsi="Calibri;serif" w:cstheme="minorHAnsi"/>
+          <w:b/>
+          <w:color w:val="575A5D"/>
+          <w:sz w:val="16"/>
+          <w:szCs w:val="16"/>
+        </w:rPr>
+        <w:t>Estudante/Ajudante:</w:t>
+      </w:r>
+      <w:r>
+        <w:rPr>
+          <w:rFonts w:cs="Calibri" w:cstheme="minorHAnsi"/>
+          <w:sz w:val="20"/>
+          <w:szCs w:val="20"/>
+        </w:rPr>
+        <w:tab/>
+        <w:tab/>
+        <w:tab/>
+      </w:r>
+      <w:r>
+        <w:rPr>
+          <w:rFonts w:eastAsia="Calibri" w:cs="Calibri" w:cstheme="minorHAnsi"/>
+          <w:b/>
+          <w:i/>
+          <w:sz w:val="20"/>
+          <w:szCs w:val="20"/>
+          <w:lang w:val="pt-PT"/>
+        </w:rPr>
+        <w:t>t40</w:t>
+      </w:r>
+    </w:p>
+    <w:p>
+      <w:pPr>
+        <w:pStyle w:val="Normal"/>
+        <w:spacing w:before="0" w:after="0"/>
+        <w:rPr>
+          <w:rFonts w:cs="Calibri" w:cstheme="minorHAnsi"/>
+          <w:sz w:val="20"/>
+          <w:szCs w:val="20"/>
+        </w:rPr>
+      </w:pPr>
+      <w:r>
+        <w:rPr>
+          <w:rFonts w:eastAsia="Calibri" w:cs="Calibri" w:cstheme="minorHAnsi"/>
+          <w:b/>
+          <w:color w:val="575A5D"/>
+        </w:rPr>
+        <w:t>5:00</w:t>
+      </w:r>
+      <w:r>
+        <w:rPr>
+          <w:rFonts w:cs="Calibri" w:cstheme="minorHAnsi"/>
+          <w:sz w:val="20"/>
+          <w:szCs w:val="20"/>
+        </w:rPr>
+        <w:tab/>
+      </w:r>
+      <w:r>
+        <w:rPr>
+          <w:rFonts w:eastAsia="Calibri" w:cs="Calibri" w:cstheme="minorHAnsi"/>
+          <w:b/>
+          <w:color w:val="575A5D"/>
+          <w:sz w:val="20"/>
+          <w:szCs w:val="20"/>
+        </w:rPr>
+        <w:t xml:space="preserve">6. </w:t>
+      </w:r>
+      <w:r>
+        <w:rPr>
+          <w:rFonts w:eastAsia="Calibri" w:cs="Calibri" w:cstheme="minorHAnsi"/>
+          <w:b/>
+          <w:bCs/>
+          <w:color w:val="auto"/>
+          <w:kern w:val="0"/>
+          <w:sz w:val="22"/>
+          <w:szCs w:val="22"/>
+          <w:lang w:val="pt-BR" w:eastAsia="en-US" w:bidi="ar-SA"/>
+        </w:rPr>
+        <w:t>t15</w:t>
+      </w:r>
+      <w:r>
+        <w:rPr>
+          <w:rFonts w:cs="Calibri" w:cstheme="minorHAnsi"/>
+          <w:b/>
+          <w:bCs/>
+          <w:sz w:val="22"/>
+          <w:szCs w:val="22"/>
+        </w:rPr>
+        <w:tab/>
+      </w:r>
+      <w:r>
+        <w:rPr>
+          <w:rFonts w:cs="Calibri" w:cstheme="minorHAnsi"/>
+          <w:sz w:val="20"/>
+          <w:szCs w:val="20"/>
+        </w:rPr>
+        <w:tab/>
+      </w:r>
+      <w:r>
+        <w:rPr>
+          <w:rFonts w:cs="Calibri" w:ascii="Calibri;serif" w:hAnsi="Calibri;serif" w:cstheme="minorHAnsi"/>
+          <w:b/>
+          <w:color w:val="575A5D"/>
+          <w:sz w:val="16"/>
+          <w:szCs w:val="16"/>
+        </w:rPr>
+        <w:t>Estudante/Ajudante:</w:t>
+      </w:r>
+      <w:r>
+        <w:rPr>
+          <w:rFonts w:cs="Calibri" w:cstheme="minorHAnsi"/>
+          <w:sz w:val="20"/>
+          <w:szCs w:val="20"/>
+        </w:rPr>
+        <w:tab/>
+        <w:tab/>
+        <w:tab/>
+      </w:r>
+      <w:r>
+        <w:rPr>
+          <w:rFonts w:eastAsia="Calibri" w:cs="Calibri" w:cstheme="minorHAnsi"/>
+          <w:b/>
+          <w:i/>
+          <w:sz w:val="20"/>
+          <w:szCs w:val="20"/>
+          <w:lang w:val="pt-PT"/>
+        </w:rPr>
+        <w:t>t41</w:t>
+      </w:r>
+    </w:p>
+    <w:p>
+      <w:pPr>
+        <w:pStyle w:val="Normal"/>
+        <w:spacing w:before="0" w:after="0"/>
+        <w:rPr>
+          <w:rFonts w:cs="Calibri" w:cstheme="minorHAnsi"/>
+          <w:sz w:val="20"/>
+          <w:szCs w:val="20"/>
+        </w:rPr>
+      </w:pPr>
+      <w:r>
+        <w:rPr>
+          <w:rFonts w:eastAsia="Calibri" w:cs="Calibri" w:cstheme="minorHAnsi"/>
+          <w:b/>
+          <w:i/>
+          <w:color w:val="575A5D"/>
+          <w:sz w:val="20"/>
+          <w:szCs w:val="20"/>
+          <w:lang w:val="pt-PT"/>
+        </w:rPr>
+        <w:t>5:00</w:t>
+      </w:r>
+      <w:r>
+        <w:rPr>
+          <w:rFonts w:eastAsia="Calibri" w:cs="Calibri" w:cstheme="minorHAnsi"/>
+          <w:b/>
+          <w:i/>
+          <w:sz w:val="20"/>
+          <w:szCs w:val="20"/>
+          <w:lang w:val="pt-PT"/>
+        </w:rPr>
+        <w:tab/>
+      </w:r>
+      <w:r>
+        <w:rPr>
+          <w:rFonts w:eastAsia="Calibri" w:cs="Calibri" w:cstheme="minorHAnsi"/>
+          <w:b/>
+          <w:i/>
+          <w:color w:val="575A5D"/>
+          <w:kern w:val="0"/>
+          <w:sz w:val="20"/>
+          <w:szCs w:val="20"/>
+          <w:lang w:val="pt-BR" w:eastAsia="en-US" w:bidi="ar-SA"/>
+        </w:rPr>
+        <w:t>7.</w:t>
+      </w:r>
+      <w:r>
+        <w:rPr>
+          <w:rFonts w:eastAsia="Calibri" w:cs="Calibri" w:cstheme="minorHAnsi"/>
+          <w:b/>
+          <w:i/>
+          <w:color w:val="575A5D"/>
+          <w:sz w:val="20"/>
+          <w:szCs w:val="20"/>
+          <w:lang w:val="pt-PT"/>
+        </w:rPr>
+        <w:t xml:space="preserve"> </w:t>
+      </w:r>
+      <w:r>
+        <w:rPr>
+          <w:rFonts w:eastAsia="Calibri" w:cs="Calibri" w:cstheme="minorHAnsi"/>
+          <w:b/>
+          <w:bCs/>
+          <w:i/>
+          <w:color w:val="auto"/>
+          <w:kern w:val="0"/>
+          <w:sz w:val="22"/>
+          <w:szCs w:val="22"/>
+          <w:lang w:val="pt-BR" w:eastAsia="en-US" w:bidi="ar-SA"/>
+        </w:rPr>
+        <w:t>t16</w:t>
+      </w:r>
+      <w:r>
+        <w:rPr>
+          <w:rFonts w:eastAsia="Calibri" w:cs="Calibri" w:cstheme="minorHAnsi"/>
+          <w:b/>
+          <w:bCs/>
+          <w:i/>
+          <w:sz w:val="22"/>
+          <w:szCs w:val="22"/>
+          <w:lang w:val="pt-PT"/>
+        </w:rPr>
+        <w:tab/>
+      </w:r>
+      <w:r>
+        <w:rPr>
+          <w:rFonts w:eastAsia="Calibri" w:cs="Calibri" w:cstheme="minorHAnsi"/>
+          <w:b/>
+          <w:i/>
+          <w:sz w:val="20"/>
+          <w:szCs w:val="20"/>
+          <w:lang w:val="pt-PT"/>
+        </w:rPr>
+        <w:tab/>
+      </w:r>
+      <w:r>
+        <w:rPr>
+          <w:rFonts w:eastAsia="Calibri" w:cs="Calibri" w:ascii="Calibri;serif" w:hAnsi="Calibri;serif" w:cstheme="minorHAnsi"/>
+          <w:b/>
+          <w:i/>
+          <w:color w:val="575A5D"/>
+          <w:sz w:val="16"/>
+          <w:szCs w:val="16"/>
+          <w:lang w:val="pt-PT"/>
+        </w:rPr>
+        <w:t>Estudante/Ajudante:</w:t>
+      </w:r>
+      <w:r>
+        <w:rPr>
+          <w:rFonts w:eastAsia="Calibri" w:cs="Calibri" w:cstheme="minorHAnsi"/>
+          <w:b/>
+          <w:i/>
+          <w:sz w:val="20"/>
+          <w:szCs w:val="20"/>
+          <w:lang w:val="pt-PT"/>
+        </w:rPr>
+        <w:tab/>
+        <w:t xml:space="preserve"> </w:t>
+        <w:tab/>
+        <w:tab/>
+        <w:t>t42</w:t>
+        <w:tab/>
+      </w:r>
+    </w:p>
+    <w:tbl>
+      <w:tblPr>
+        <w:tblStyle w:val="Tabelacomgrade1"/>
+        <w:tblW w:w="10268" w:type="dxa"/>
+        <w:jc w:val="left"/>
+        <w:tblInd w:w="0" w:type="dxa"/>
+        <w:tblLayout w:type="fixed"/>
+        <w:tblCellMar>
+          <w:top w:w="0" w:type="dxa"/>
+          <w:left w:w="108" w:type="dxa"/>
+          <w:bottom w:w="0" w:type="dxa"/>
+          <w:right w:w="108" w:type="dxa"/>
+        </w:tblCellMar>
+        <w:tblLook w:firstRow="1" w:noVBand="1" w:lastRow="0" w:firstColumn="1" w:lastColumn="0" w:noHBand="0" w:val="04a0"/>
+      </w:tblPr>
+      <w:tblGrid>
+        <w:gridCol w:w="5170"/>
+        <w:gridCol w:w="5097"/>
+      </w:tblGrid>
+      <w:tr>
+        <w:trPr>
+          <w:trHeight w:val="288" w:hRule="atLeast"/>
+        </w:trPr>
+        <w:tc>
+          <w:tcPr>
+            <w:tcW w:w="5170" w:type="dxa"/>
+            <w:tcBorders>
+              <w:top w:val="nil"/>
+              <w:left w:val="nil"/>
+              <w:bottom w:val="nil"/>
+              <w:right w:val="nil"/>
+            </w:tcBorders>
+            <w:shd w:color="auto" w:fill="7E0024" w:val="clear"/>
+            <w:vAlign w:val="center"/>
+          </w:tcPr>
+          <w:p>
+            <w:pPr>
+              <w:pStyle w:val="Normal"/>
+              <w:widowControl/>
+              <w:suppressAutoHyphens w:val="true"/>
+              <w:spacing w:lineRule="auto" w:line="240" w:before="0" w:after="0"/>
+              <w:jc w:val="left"/>
+              <w:rPr>
+                <w:b/>
+                <w:sz w:val="20"/>
+                <w:szCs w:val="20"/>
+                <w:lang w:val="pt-BR"/>
+              </w:rPr>
+            </w:pPr>
+            <w:r>
+              <w:rPr>
+                <w:rFonts w:eastAsia="Calibri" w:cs="Times New Roman"/>
+                <w:b/>
+                <w:color w:val="FFFFFF"/>
+                <w:kern w:val="0"/>
+                <w:sz w:val="20"/>
+                <w:szCs w:val="20"/>
+                <w:lang w:val="pt-BR" w:eastAsia="en-US" w:bidi="ar-SA"/>
+              </w:rPr>
+              <w:t>NOSSA VIDA CRISTÃ</w:t>
+            </w:r>
+          </w:p>
+        </w:tc>
+        <w:tc>
+          <w:tcPr>
+            <w:tcW w:w="5097" w:type="dxa"/>
+            <w:tcBorders>
+              <w:top w:val="nil"/>
+              <w:left w:val="nil"/>
+              <w:bottom w:val="nil"/>
+              <w:right w:val="nil"/>
+            </w:tcBorders>
+            <w:vAlign w:val="center"/>
+          </w:tcPr>
+          <w:p>
+            <w:pPr>
+              <w:pStyle w:val="Normal"/>
+              <w:widowControl/>
+              <w:suppressAutoHyphens w:val="true"/>
+              <w:spacing w:lineRule="auto" w:line="240" w:before="0" w:after="120"/>
+              <w:jc w:val="left"/>
+              <w:rPr>
+                <w:sz w:val="20"/>
+                <w:szCs w:val="20"/>
+                <w:lang w:val="pt-BR"/>
+              </w:rPr>
+            </w:pPr>
+            <w:r>
+              <w:rPr>
+                <w:sz w:val="20"/>
+                <w:szCs w:val="20"/>
+                <w:lang w:val="pt-BR"/>
+              </w:rPr>
+            </w:r>
+          </w:p>
+        </w:tc>
+      </w:tr>
+    </w:tbl>
+    <w:p>
+      <w:pPr>
+        <w:pStyle w:val="Normal"/>
+        <w:spacing w:before="0" w:after="0"/>
+        <w:rPr>
+          <w:rFonts w:cs="Calibri" w:cstheme="minorHAnsi"/>
+          <w:sz w:val="20"/>
+          <w:szCs w:val="20"/>
+          <w:u w:val="single"/>
+        </w:rPr>
+      </w:pPr>
+      <w:r>
+        <w:rPr>
+          <w:rFonts w:eastAsia="Calibri" w:cs="Times New Roman"/>
+          <w:b/>
+          <w:color w:val="575A5D"/>
+        </w:rPr>
+        <w:tab/>
+        <w:t>•</w:t>
+      </w:r>
+      <w:r>
+        <w:rPr>
+          <w:rStyle w:val="Strong"/>
+          <w:rFonts w:eastAsia="Times New Roman" w:cs="Latha" w:ascii="Calibri Light" w:hAnsi="Calibri Light" w:asciiTheme="majorHAnsi" w:hAnsiTheme="majorHAnsi"/>
+          <w:i/>
+          <w:color w:val="0000FF"/>
+          <w:lang w:val="af-ZA" w:bidi="ta-IN"/>
+        </w:rPr>
+        <w:t>t18</w:t>
+      </w:r>
+      <w:r>
+        <w:rPr>
+          <w:rFonts w:cs="Calibri" w:cstheme="minorHAnsi"/>
+          <w:sz w:val="20"/>
+          <w:szCs w:val="20"/>
+        </w:rPr>
+        <w:tab/>
+      </w:r>
+    </w:p>
+    <w:p>
+      <w:pPr>
+        <w:pStyle w:val="Normal"/>
+        <w:spacing w:before="0" w:after="0"/>
+        <w:rPr>
+          <w:rFonts w:ascii="Calibri" w:hAnsi="Calibri" w:eastAsia="Calibri" w:cs="Calibri"/>
+          <w:b/>
+          <w:i/>
+          <w:i/>
+          <w:lang w:val="pt-PT"/>
+        </w:rPr>
+      </w:pPr>
+      <w:r>
+        <w:rPr>
+          <w:rFonts w:eastAsia="Calibri" w:cs="Times New Roman"/>
+          <w:b/>
+          <w:color w:val="575A5D"/>
+        </w:rPr>
+        <w:t>10:00</w:t>
+        <w:tab/>
+        <w:t>•</w:t>
+      </w:r>
+      <w:r>
+        <w:rPr>
+          <w:rFonts w:eastAsia="Calibri" w:cs="Times New Roman"/>
+          <w:b/>
+          <w:bCs/>
+          <w:i/>
+          <w:sz w:val="22"/>
+          <w:szCs w:val="22"/>
+          <w:lang w:val="af-ZA" w:bidi="ta-IN"/>
+        </w:rPr>
+        <w:t>t19</w:t>
+      </w:r>
+      <w:r>
+        <w:rPr>
+          <w:rFonts w:cs="Calibri" w:cstheme="minorHAnsi"/>
+          <w:sz w:val="22"/>
+          <w:szCs w:val="22"/>
+        </w:rPr>
+        <w:tab/>
+      </w:r>
+      <w:r>
+        <w:rPr>
+          <w:rFonts w:cs="Calibri" w:cstheme="minorHAnsi"/>
+          <w:sz w:val="20"/>
+          <w:szCs w:val="20"/>
+        </w:rPr>
+        <w:tab/>
+      </w:r>
+      <w:r>
+        <w:rPr>
+          <w:rFonts w:eastAsia="Calibri" w:cs="Calibri" w:cstheme="minorHAnsi"/>
+          <w:b/>
+          <w:i/>
+          <w:sz w:val="20"/>
+          <w:szCs w:val="20"/>
+          <w:lang w:val="pt-PT"/>
+        </w:rPr>
+        <w:t xml:space="preserve"> t43</w:t>
+      </w:r>
+    </w:p>
+    <w:p>
+      <w:pPr>
+        <w:pStyle w:val="Normal"/>
+        <w:spacing w:before="0" w:after="0"/>
+        <w:rPr>
+          <w:rFonts w:ascii="Calibri" w:hAnsi="Calibri" w:eastAsia="Calibri" w:cs="Calibri"/>
+          <w:b/>
+          <w:i/>
+          <w:i/>
+          <w:lang w:val="pt-PT"/>
+        </w:rPr>
+      </w:pPr>
+      <w:r>
+        <w:rPr>
+          <w:rFonts w:eastAsia="Calibri" w:cs="Times New Roman"/>
+          <w:b/>
+          <w:color w:val="575A5D"/>
+        </w:rPr>
+        <w:t>5:00</w:t>
+        <w:tab/>
+        <w:t>•</w:t>
+      </w:r>
+      <w:r>
+        <w:rPr>
+          <w:rFonts w:eastAsia="Calibri" w:cs="Times New Roman"/>
+          <w:b/>
+          <w:bCs/>
+          <w:i/>
+          <w:sz w:val="22"/>
+          <w:szCs w:val="22"/>
+          <w:lang w:val="af-ZA" w:bidi="ta-IN"/>
+        </w:rPr>
+        <w:t>t20</w:t>
+      </w:r>
+      <w:r>
+        <w:rPr>
+          <w:rFonts w:cs="Calibri" w:cstheme="minorHAnsi"/>
+          <w:sz w:val="22"/>
+          <w:szCs w:val="22"/>
+        </w:rPr>
+        <w:tab/>
+      </w:r>
+      <w:r>
+        <w:rPr>
+          <w:rFonts w:cs="Calibri" w:cstheme="minorHAnsi"/>
+          <w:sz w:val="20"/>
+          <w:szCs w:val="20"/>
+        </w:rPr>
+        <w:tab/>
+      </w:r>
+      <w:r>
+        <w:rPr>
+          <w:rFonts w:eastAsia="Calibri" w:cs="Calibri" w:cstheme="minorHAnsi"/>
+          <w:b/>
+          <w:i/>
+          <w:sz w:val="20"/>
+          <w:szCs w:val="20"/>
+          <w:lang w:val="pt-PT"/>
+        </w:rPr>
+        <w:t xml:space="preserve"> t44</w:t>
+      </w:r>
+    </w:p>
+    <w:p>
+      <w:pPr>
+        <w:pStyle w:val="Normal"/>
+        <w:spacing w:before="0" w:after="0"/>
+        <w:rPr>
+          <w:rFonts w:ascii="Calibri" w:hAnsi="Calibri" w:eastAsia="Calibri" w:cs="Calibri"/>
+          <w:b/>
+          <w:i/>
+          <w:i/>
+          <w:lang w:val="pt-PT"/>
+        </w:rPr>
+      </w:pPr>
+      <w:r>
+        <w:rPr>
+          <w:rFonts w:eastAsia="Calibri" w:cs="Times New Roman"/>
+          <w:b/>
+          <w:color w:val="575A5D"/>
+        </w:rPr>
+        <w:t>30:00</w:t>
+        <w:tab/>
+        <w:t>•</w:t>
+      </w:r>
+      <w:r>
+        <w:rPr>
+          <w:rFonts w:eastAsia="Calibri" w:cs="Times New Roman"/>
+          <w:b/>
+          <w:bCs/>
+          <w:i/>
+          <w:sz w:val="22"/>
+          <w:szCs w:val="22"/>
+          <w:lang w:val="af-ZA" w:bidi="ta-IN"/>
+        </w:rPr>
+        <w:t>t21</w:t>
+      </w:r>
+      <w:r>
+        <w:rPr>
+          <w:rFonts w:cs="Calibri" w:cstheme="minorHAnsi"/>
+          <w:sz w:val="22"/>
+          <w:szCs w:val="22"/>
+        </w:rPr>
+        <w:tab/>
+      </w:r>
+      <w:r>
+        <w:rPr>
+          <w:rFonts w:cs="Calibri" w:cstheme="minorHAnsi"/>
+          <w:sz w:val="20"/>
+          <w:szCs w:val="20"/>
+        </w:rPr>
+        <w:tab/>
+      </w:r>
+      <w:r>
+        <w:rPr>
+          <w:rFonts w:eastAsia="Calibri" w:cs="Calibri" w:cstheme="minorHAnsi"/>
+          <w:b/>
+          <w:i/>
+          <w:sz w:val="20"/>
+          <w:szCs w:val="20"/>
+          <w:lang w:val="pt-PT"/>
+        </w:rPr>
+        <w:t xml:space="preserve"> t45</w:t>
+      </w:r>
+    </w:p>
+    <w:p>
+      <w:pPr>
+        <w:pStyle w:val="Normal"/>
+        <w:spacing w:before="0" w:after="0"/>
+        <w:rPr>
+          <w:rFonts w:cs="Calibri" w:cstheme="minorHAnsi"/>
+          <w:sz w:val="20"/>
+          <w:szCs w:val="20"/>
+        </w:rPr>
+      </w:pPr>
+      <w:r>
+        <w:rPr>
+          <w:rFonts w:eastAsia="Calibri" w:cs="Times New Roman"/>
+          <w:b/>
+          <w:color w:val="575A5D"/>
+        </w:rPr>
+        <w:t>3:00</w:t>
+        <w:tab/>
+        <w:t>•</w:t>
+      </w:r>
+      <w:r>
+        <w:rPr>
+          <w:rFonts w:cs="Calibri" w:cstheme="minorHAnsi"/>
+          <w:sz w:val="20"/>
+          <w:szCs w:val="20"/>
+        </w:rPr>
+        <w:t>Comentários finais (3 min)</w:t>
+        <w:tab/>
+      </w:r>
+    </w:p>
+    <w:p>
+      <w:pPr>
+        <w:pStyle w:val="Normal"/>
+        <w:spacing w:before="0" w:after="0"/>
+        <w:rPr>
+          <w:rFonts w:cs="Calibri" w:cstheme="minorHAnsi"/>
+          <w:sz w:val="20"/>
+          <w:szCs w:val="20"/>
+        </w:rPr>
+      </w:pPr>
+      <w:r>
+        <w:rPr>
+          <w:rFonts w:eastAsia="Calibri" w:cs="Times New Roman"/>
+          <w:b/>
+          <w:color w:val="575A5D"/>
+        </w:rPr>
+        <w:tab/>
+        <w:t>•</w:t>
+      </w:r>
+      <w:r>
+        <w:rPr>
+          <w:rStyle w:val="Strong"/>
+          <w:rFonts w:eastAsia="Times New Roman" w:cs="Latha" w:ascii="Calibri Light" w:hAnsi="Calibri Light" w:asciiTheme="majorHAnsi" w:hAnsiTheme="majorHAnsi"/>
+          <w:i/>
+          <w:color w:val="0000FF"/>
+          <w:lang w:val="af-ZA" w:bidi="ta-IN"/>
+        </w:rPr>
+        <w:t>t23</w:t>
+      </w:r>
+      <w:r>
+        <w:rPr>
+          <w:rFonts w:cs="Calibri" w:cstheme="minorHAnsi"/>
+          <w:sz w:val="20"/>
+          <w:szCs w:val="20"/>
+        </w:rPr>
+        <w:tab/>
+        <w:tab/>
+        <w:tab/>
+        <w:tab/>
+        <w:tab/>
+        <w:tab/>
+        <w:tab/>
+      </w:r>
+      <w:r>
+        <w:rPr>
+          <w:rFonts w:eastAsia="Calibri" w:cs="Times New Roman"/>
+          <w:b/>
+          <w:color w:val="575A5D"/>
+        </w:rPr>
+        <w:t xml:space="preserve">Oração: </w:t>
+      </w:r>
+      <w:r>
+        <w:rPr>
+          <w:rFonts w:eastAsia="Calibri" w:cs="Calibri" w:cstheme="minorHAnsi"/>
+          <w:b/>
+          <w:i/>
+          <w:color w:val="575A5D"/>
+          <w:sz w:val="20"/>
+          <w:szCs w:val="20"/>
+          <w:lang w:val="pt-PT"/>
+        </w:rPr>
+        <w:t xml:space="preserve"> t3</w:t>
+      </w:r>
+      <w:r>
+        <w:rPr>
+          <w:rFonts w:eastAsia="Calibri" w:cs="Calibri" w:cstheme="minorHAnsi"/>
+          <w:b/>
+          <w:i/>
+          <w:color w:val="575A5D"/>
+          <w:sz w:val="20"/>
+          <w:szCs w:val="20"/>
+          <w:lang w:val="pt-PT"/>
+        </w:rPr>
+        <w:t>4</w:t>
+      </w:r>
+    </w:p>
+    <w:p>
+      <w:pPr>
+        <w:pStyle w:val="Normal"/>
+        <w:spacing w:before="0" w:after="160"/>
+        <w:rPr>
+          <w:sz w:val="20"/>
+          <w:szCs w:val="20"/>
+        </w:rPr>
+      </w:pPr>
+      <w:r>
+        <w:rPr/>
+        <w:drawing>
+          <wp:inline distT="0" distB="0" distL="0" distR="0">
+            <wp:extent cx="5400040" cy="90170"/>
+            <wp:effectExtent l="0" t="0" r="0" b="0"/>
+            <wp:docPr id="6" name="Imagem 6" descr=""/>
+            <wp:cNvGraphicFramePr>
+              <a:graphicFrameLocks xmlns:a="http://schemas.openxmlformats.org/drawingml/2006/main" noChangeAspect="1"/>
+            </wp:cNvGraphicFramePr>
+            <a:graphic xmlns:a="http://schemas.openxmlformats.org/drawingml/2006/main">
+              <a:graphicData uri="http://schemas.openxmlformats.org/drawingml/2006/picture">
+                <pic:pic xmlns:pic="http://schemas.openxmlformats.org/drawingml/2006/picture">
+                  <pic:nvPicPr>
+                    <pic:cNvPr id="6" name="Imagem 6" descr=""/>
+                    <pic:cNvPicPr>
+                      <a:picLocks noChangeAspect="1" noChangeArrowheads="1"/>
+                    </pic:cNvPicPr>
+                  </pic:nvPicPr>
+                  <pic:blipFill>
+                    <a:blip r:embed="rId7"/>
+                    <a:stretch>
+                      <a:fillRect/>
+                    </a:stretch>
+                  </pic:blipFill>
+                  <pic:spPr bwMode="auto">
+                    <a:xfrm>
+                      <a:off x="0" y="0"/>
+                      <a:ext cx="5400040" cy="90170"/>
+                    </a:xfrm>
+                    <a:prstGeom prst="rect">
+                      <a:avLst/>
+                    </a:prstGeom>
+                    <a:noFill/>
+                  </pic:spPr>
+                </pic:pic>
+              </a:graphicData>
+            </a:graphic>
+          </wp:inline>
+        </w:drawing>
       </w:r>
     </w:p>
     <w:sectPr>
-      <w:footerReference w:type="even" r:id="rId6"/>
-      <w:footerReference w:type="default" r:id="rId7"/>
-      <w:footerReference w:type="first" r:id="rId8"/>
+      <w:footerReference w:type="even" r:id="rId8"/>
+      <w:footerReference w:type="default" r:id="rId9"/>
+      <w:footerReference w:type="first" r:id="rId10"/>
       <w:type w:val="nextPage"/>
       <w:pgSz w:w="11906" w:h="16838"/>
       <w:pgMar w:left="720" w:right="720" w:gutter="0" w:header="0" w:top="720" w:footer="0" w:bottom="720"/>
@@ -7468,7 +9447,7 @@
       <w:spacing w:before="240" w:after="120"/>
     </w:pPr>
     <w:rPr>
-      <w:rFonts w:ascii="Liberation Sans" w:hAnsi="Liberation Sans" w:eastAsia="Microsoft YaHei" w:cs="Lucida Sans"/>
+      <w:rFonts w:ascii="Liberation Sans" w:hAnsi="Liberation Sans" w:eastAsia="Microsoft YaHei" w:cs="Arial"/>
       <w:sz w:val="28"/>
       <w:szCs w:val="28"/>
     </w:rPr>
@@ -7513,7 +9492,7 @@
       <w:suppressLineNumbers/>
     </w:pPr>
     <w:rPr>
-      <w:rFonts w:cs="Lucida Sans"/>
+      <w:rFonts w:cs="Arial"/>
     </w:rPr>
   </w:style>
   <w:style w:type="paragraph" w:styleId="Ttulouser">
@@ -7526,7 +9505,7 @@
       <w:spacing w:before="240" w:after="120"/>
     </w:pPr>
     <w:rPr>
-      <w:rFonts w:ascii="Liberation Sans" w:hAnsi="Liberation Sans" w:eastAsia="Microsoft YaHei" w:cs="Arial"/>
+      <w:rFonts w:ascii="Liberation Sans" w:hAnsi="Liberation Sans" w:eastAsia="Microsoft YaHei" w:cs="Lucida Sans"/>
       <w:sz w:val="28"/>
       <w:szCs w:val="28"/>
     </w:rPr>
@@ -7539,7 +9518,7 @@
       <w:suppressLineNumbers/>
     </w:pPr>
     <w:rPr>
-      <w:rFonts w:cs="Arial"/>
+      <w:rFonts w:cs="Lucida Sans"/>
     </w:rPr>
   </w:style>
   <w:style w:type="paragraph" w:styleId="CabealhoeRodap">
@@ -7551,13 +9530,6 @@
   </w:style>
   <w:style w:type="paragraph" w:styleId="Cabealhoerodap1">
     <w:name w:val="Cabeçalho e rodapé1"/>
-    <w:basedOn w:val="Normal"/>
-    <w:qFormat/>
-    <w:pPr/>
-    <w:rPr/>
-  </w:style>
-  <w:style w:type="paragraph" w:styleId="Cabealhoerodap2">
-    <w:name w:val="Cabeçalho e rodapé2"/>
     <w:basedOn w:val="Normal"/>
     <w:qFormat/>
     <w:pPr/>
@@ -7597,8 +9569,8 @@
     </w:pPr>
     <w:rPr/>
   </w:style>
-  <w:style w:type="numbering" w:styleId="Semlistauser" w:default="1">
-    <w:name w:val="Sem lista (user)"/>
+  <w:style w:type="numbering" w:styleId="Semlista" w:default="1">
+    <w:name w:val="Sem lista"/>
     <w:uiPriority w:val="99"/>
     <w:semiHidden/>
     <w:unhideWhenUsed/>

</xml_diff>